<commit_message>
se realiza los cambios solicitados por paula
</commit_message>
<xml_diff>
--- a/public/plantilla-integra.docx
+++ b/public/plantilla-integra.docx
@@ -1,18 +1,11 @@
 
 <file path=word/document.xml><?xml version="1.0" encoding="utf-8"?>
-<w:document xmlns:wpc="http://schemas.microsoft.com/office/word/2010/wordprocessingCanvas" xmlns:mc="http://schemas.openxmlformats.org/markup-compatibility/2006" xmlns:o="urn:schemas-microsoft-com:office:office" xmlns:r="http://schemas.openxmlformats.org/officeDocument/2006/relationships" xmlns:m="http://schemas.openxmlformats.org/officeDocument/2006/math" xmlns:v="urn:schemas-microsoft-com:vml" xmlns:wp14="http://schemas.microsoft.com/office/word/2010/wordprocessingDrawing" xmlns:wp="http://schemas.openxmlformats.org/drawingml/2006/wordprocessingDrawing" xmlns:w10="urn:schemas-microsoft-com:office:word" xmlns:w="http://schemas.openxmlformats.org/wordprocessingml/2006/main" xmlns:w14="http://schemas.microsoft.com/office/word/2010/wordml" xmlns:w15="http://schemas.microsoft.com/office/word/2012/wordml" xmlns:wpg="http://schemas.microsoft.com/office/word/2010/wordprocessingGroup" xmlns:wpi="http://schemas.microsoft.com/office/word/2010/wordprocessingInk" xmlns:wne="http://schemas.microsoft.com/office/word/2006/wordml" xmlns:wps="http://schemas.microsoft.com/office/word/2010/wordprocessingShape" xmlns:cx="http://schemas.microsoft.com/office/drawing/2014/chartex" xmlns:cx1="http://schemas.microsoft.com/office/drawing/2015/9/8/chartex" xmlns:cx2="http://schemas.microsoft.com/office/drawing/2015/10/21/chartex" xmlns:cx3="http://schemas.microsoft.com/office/drawing/2016/5/9/chartex" xmlns:cx4="http://schemas.microsoft.com/office/drawing/2016/5/10/chartex" xmlns:cx5="http://schemas.microsoft.com/office/drawing/2016/5/11/chartex" xmlns:cx6="http://schemas.microsoft.com/office/drawing/2016/5/12/chartex" xmlns:cx7="http://schemas.microsoft.com/office/drawing/2016/5/13/chartex" xmlns:cx8="http://schemas.microsoft.com/office/drawing/2016/5/14/chartex" xmlns:aink="http://schemas.microsoft.com/office/drawing/2016/ink" xmlns:am3d="http://schemas.microsoft.com/office/drawing/2017/model3d" xmlns:w16cex="http://schemas.microsoft.com/office/word/2018/wordml/cex" xmlns:w16cid="http://schemas.microsoft.com/office/word/2016/wordml/cid" xmlns:w16="http://schemas.microsoft.com/office/word/2018/wordml" xmlns:w16sdtdh="http://schemas.microsoft.com/office/word/2020/wordml/sdtdatahash" xmlns:w16se="http://schemas.microsoft.com/office/word/2015/wordml/symex" mc:Ignorable="w14 w15 wp14">
+<w:document xmlns:wpc="http://schemas.microsoft.com/office/word/2010/wordprocessingCanvas" xmlns:cx="http://schemas.microsoft.com/office/drawing/2014/chartex" xmlns:cx1="http://schemas.microsoft.com/office/drawing/2015/9/8/chartex" xmlns:cx2="http://schemas.microsoft.com/office/drawing/2015/10/21/chartex" xmlns:cx3="http://schemas.microsoft.com/office/drawing/2016/5/9/chartex" xmlns:cx4="http://schemas.microsoft.com/office/drawing/2016/5/10/chartex" xmlns:cx5="http://schemas.microsoft.com/office/drawing/2016/5/11/chartex" xmlns:cx6="http://schemas.microsoft.com/office/drawing/2016/5/12/chartex" xmlns:cx7="http://schemas.microsoft.com/office/drawing/2016/5/13/chartex" xmlns:cx8="http://schemas.microsoft.com/office/drawing/2016/5/14/chartex" xmlns:mc="http://schemas.openxmlformats.org/markup-compatibility/2006" xmlns:aink="http://schemas.microsoft.com/office/drawing/2016/ink" xmlns:am3d="http://schemas.microsoft.com/office/drawing/2017/model3d" xmlns:o="urn:schemas-microsoft-com:office:office" xmlns:oel="http://schemas.microsoft.com/office/2019/extlst" xmlns:r="http://schemas.openxmlformats.org/officeDocument/2006/relationships" xmlns:m="http://schemas.openxmlformats.org/officeDocument/2006/math" xmlns:v="urn:schemas-microsoft-com:vml" xmlns:wp14="http://schemas.microsoft.com/office/word/2010/wordprocessingDrawing" xmlns:wp="http://schemas.openxmlformats.org/drawingml/2006/wordprocessingDrawing" xmlns:w10="urn:schemas-microsoft-com:office:word" xmlns:w="http://schemas.openxmlformats.org/wordprocessingml/2006/main" xmlns:w14="http://schemas.microsoft.com/office/word/2010/wordml" xmlns:w15="http://schemas.microsoft.com/office/word/2012/wordml" xmlns:w16cex="http://schemas.microsoft.com/office/word/2018/wordml/cex" xmlns:w16cid="http://schemas.microsoft.com/office/word/2016/wordml/cid" xmlns:w16="http://schemas.microsoft.com/office/word/2018/wordml" xmlns:w16du="http://schemas.microsoft.com/office/word/2023/wordml/word16du" xmlns:w16sdtdh="http://schemas.microsoft.com/office/word/2020/wordml/sdtdatahash" xmlns:w16sdtfl="http://schemas.microsoft.com/office/word/2024/wordml/sdtformatlock" xmlns:w16se="http://schemas.microsoft.com/office/word/2015/wordml/symex" xmlns:wpg="http://schemas.microsoft.com/office/word/2010/wordprocessingGroup" xmlns:wpi="http://schemas.microsoft.com/office/word/2010/wordprocessingInk" xmlns:wne="http://schemas.microsoft.com/office/word/2006/wordml" xmlns:wps="http://schemas.microsoft.com/office/word/2010/wordprocessingShape" mc:Ignorable="w14 w15 w16se w16cid w16 w16cex w16sdtdh w16sdtfl w16du wp14">
   <w:body>
     <w:p>
       <w:pPr>
         <w:spacing w:after="200"/>
       </w:pPr>
-      <w:r>
-        <w:rPr>
-          <w:sz w:val="16"/>
-          <w:szCs w:val="16"/>
-          <w:rFonts w:ascii="Calibri Light" w:cs="Calibri Light" w:eastAsia="Calibri Light" w:hAnsi="Calibri Light"/>
-        </w:rPr>
-      </w:r>
     </w:p>
     <w:p>
       <w:pPr>
@@ -26,9 +19,8 @@
           <w:color w:val="479589"/>
           <w:sz w:val="40"/>
           <w:szCs w:val="40"/>
-          <w:rFonts w:ascii="Calibri Light" w:cs="Calibri Light" w:eastAsia="Calibri Light" w:hAnsi="Calibri Light"/>
-        </w:rPr>
-        <w:t xml:space="preserve">PROPUESTA DE COLABORACIÓN</w:t>
+        </w:rPr>
+        <w:t>PROPUESTA DE COLABORACIÓN</w:t>
       </w:r>
     </w:p>
     <w:p>
@@ -40,44 +32,21 @@
         <w:rPr>
           <w:b/>
           <w:bCs/>
-          <w:color w:val="6b7280"/>
+          <w:color w:val="6B7280"/>
           <w:sz w:val="20"/>
           <w:szCs w:val="20"/>
-          <w:rFonts w:ascii="Calibri Light" w:cs="Calibri Light" w:eastAsia="Calibri Light" w:hAnsi="Calibri Light"/>
-        </w:rPr>
-        <w:t xml:space="preserve">{{FECHA}}</w:t>
+        </w:rPr>
+        <w:t>{{FECHA}}</w:t>
       </w:r>
     </w:p>
     <w:p>
       <w:pPr>
         <w:pBdr>
-          <w:bottom w:val="single" w:color="C73E3A" w:sz="16" w:space="1"/>
+          <w:bottom w:val="single" w:sz="16" w:space="1" w:color="C73E3A"/>
         </w:pBdr>
         <w:spacing w:after="240"/>
         <w:jc w:val="center"/>
       </w:pPr>
-      <w:r>
-        <w:rPr>
-          <w:sz w:val="8"/>
-          <w:szCs w:val="8"/>
-          <w:rFonts w:ascii="Calibri Light" w:cs="Calibri Light" w:eastAsia="Calibri Light" w:hAnsi="Calibri Light"/>
-        </w:rPr>
-      </w:r>
-    </w:p>
-    <w:p>
-      <w:pPr>
-        <w:spacing w:after="80"/>
-        <w:jc w:val="center"/>
-      </w:pPr>
-      <w:r>
-        <w:rPr>
-          <w:color w:val="6b7280"/>
-          <w:sz w:val="18"/>
-          <w:szCs w:val="18"/>
-          <w:rFonts w:ascii="Calibri Light" w:cs="Calibri Light" w:eastAsia="Calibri Light" w:hAnsi="Calibri Light"/>
-        </w:rPr>
-        <w:t xml:space="preserve">Preparada para</w:t>
-      </w:r>
     </w:p>
     <w:p>
       <w:pPr>
@@ -88,12 +57,11 @@
         <w:rPr>
           <w:b/>
           <w:bCs/>
-          <w:color w:val="1a1a1a"/>
+          <w:color w:val="1A1A1A"/>
           <w:sz w:val="44"/>
           <w:szCs w:val="44"/>
-          <w:rFonts w:ascii="Calibri Light" w:cs="Calibri Light" w:eastAsia="Calibri Light" w:hAnsi="Calibri Light"/>
-        </w:rPr>
-        <w:t xml:space="preserve">{{NOMBRE_EMPRESA}}</w:t>
+        </w:rPr>
+        <w:t>{{NOMBRE_EMPRESA}}</w:t>
       </w:r>
     </w:p>
     <w:p>
@@ -105,18 +73,17 @@
         <w:rPr>
           <w:i/>
           <w:iCs/>
-          <w:color w:val="6b7280"/>
+          <w:color w:val="6B7280"/>
           <w:sz w:val="20"/>
           <w:szCs w:val="20"/>
-          <w:rFonts w:ascii="Calibri Light" w:cs="Calibri Light" w:eastAsia="Calibri Light" w:hAnsi="Calibri Light"/>
-        </w:rPr>
-        <w:t xml:space="preserve">{{SECTOR}}</w:t>
+        </w:rPr>
+        <w:t>{{SECTOR}}</w:t>
       </w:r>
     </w:p>
     <w:p>
       <w:pPr>
         <w:pBdr>
-          <w:bottom w:val="single" w:color="479589" w:sz="8" w:space="4"/>
+          <w:bottom w:val="single" w:sz="8" w:space="4" w:color="479589"/>
         </w:pBdr>
         <w:spacing w:before="200" w:after="120"/>
       </w:pPr>
@@ -127,9 +94,8 @@
           <w:color w:val="479589"/>
           <w:sz w:val="24"/>
           <w:szCs w:val="24"/>
-          <w:rFonts w:ascii="Calibri Light" w:cs="Calibri Light" w:eastAsia="Calibri Light" w:hAnsi="Calibri Light"/>
-        </w:rPr>
-        <w:t xml:space="preserve">OBJETIVO</w:t>
+        </w:rPr>
+        <w:t>OBJETIVO</w:t>
       </w:r>
     </w:p>
     <w:p>
@@ -139,18 +105,15 @@
       </w:pPr>
       <w:r>
         <w:rPr>
-          <w:color w:val="1a1a1a"/>
-          <w:sz w:val="22"/>
-          <w:szCs w:val="22"/>
-          <w:rFonts w:ascii="Calibri Light" w:cs="Calibri Light" w:eastAsia="Calibri Light" w:hAnsi="Calibri Light"/>
-        </w:rPr>
-        <w:t xml:space="preserve">{{TEXTO_OBJETIVO}}</w:t>
+          <w:color w:val="1A1A1A"/>
+        </w:rPr>
+        <w:t>{{TEXTO_OBJETIVO}}</w:t>
       </w:r>
     </w:p>
     <w:p>
       <w:pPr>
         <w:pBdr>
-          <w:bottom w:val="single" w:color="479589" w:sz="8" w:space="4"/>
+          <w:bottom w:val="single" w:sz="8" w:space="4" w:color="479589"/>
         </w:pBdr>
         <w:spacing w:before="200" w:after="120"/>
       </w:pPr>
@@ -161,9 +124,8 @@
           <w:color w:val="479589"/>
           <w:sz w:val="24"/>
           <w:szCs w:val="24"/>
-          <w:rFonts w:ascii="Calibri Light" w:cs="Calibri Light" w:eastAsia="Calibri Light" w:hAnsi="Calibri Light"/>
-        </w:rPr>
-        <w:t xml:space="preserve">LÍNEAS DE COLABORACIÓN</w:t>
+        </w:rPr>
+        <w:t>LÍNEAS DE COLABORACIÓN</w:t>
       </w:r>
     </w:p>
     <w:p>
@@ -176,26 +138,20 @@
           <w:b/>
           <w:bCs/>
           <w:color w:val="C73E3A"/>
-          <w:sz w:val="22"/>
-          <w:szCs w:val="22"/>
-          <w:rFonts w:ascii="Calibri Light" w:cs="Calibri Light" w:eastAsia="Calibri Light" w:hAnsi="Calibri Light"/>
         </w:rPr>
         <w:t xml:space="preserve">• </w:t>
       </w:r>
       <w:r>
         <w:rPr>
-          <w:color w:val="1a1a1a"/>
-          <w:sz w:val="22"/>
-          <w:szCs w:val="22"/>
-          <w:rFonts w:ascii="Calibri Light" w:cs="Calibri Light" w:eastAsia="Calibri Light" w:hAnsi="Calibri Light"/>
-        </w:rPr>
-        <w:t xml:space="preserve">{{LINEAS}}</w:t>
+          <w:color w:val="1A1A1A"/>
+        </w:rPr>
+        <w:t>{{LINEAS}}</w:t>
       </w:r>
     </w:p>
     <w:p>
       <w:pPr>
         <w:pBdr>
-          <w:bottom w:val="single" w:color="479589" w:sz="8" w:space="4"/>
+          <w:bottom w:val="single" w:sz="8" w:space="4" w:color="479589"/>
         </w:pBdr>
         <w:spacing w:before="200" w:after="120"/>
       </w:pPr>
@@ -206,9 +162,8 @@
           <w:color w:val="479589"/>
           <w:sz w:val="24"/>
           <w:szCs w:val="24"/>
-          <w:rFonts w:ascii="Calibri Light" w:cs="Calibri Light" w:eastAsia="Calibri Light" w:hAnsi="Calibri Light"/>
-        </w:rPr>
-        <w:t xml:space="preserve">APORTACIÓN ECONÓMICA</w:t>
+        </w:rPr>
+        <w:t>APORTACIÓN ECONÓMICA</w:t>
       </w:r>
     </w:p>
     <w:p>
@@ -222,16 +177,12 @@
           <w:color w:val="479589"/>
           <w:sz w:val="28"/>
           <w:szCs w:val="28"/>
-          <w:rFonts w:ascii="Calibri Light" w:cs="Calibri Light" w:eastAsia="Calibri Light" w:hAnsi="Calibri Light"/>
-        </w:rPr>
-        <w:t xml:space="preserve">{{IMPORTE}}</w:t>
-      </w:r>
-      <w:r>
-        <w:rPr>
-          <w:color w:val="6b7280"/>
-          <w:sz w:val="22"/>
-          <w:szCs w:val="22"/>
-          <w:rFonts w:ascii="Calibri Light" w:cs="Calibri Light" w:eastAsia="Calibri Light" w:hAnsi="Calibri Light"/>
+        </w:rPr>
+        <w:t>{{IMPORTE}}</w:t>
+      </w:r>
+      <w:r>
+        <w:rPr>
+          <w:color w:val="6B7280"/>
         </w:rPr>
         <w:t xml:space="preserve">  —  vía {{VIA}}</w:t>
       </w:r>
@@ -244,12 +195,11 @@
         <w:rPr>
           <w:i/>
           <w:iCs/>
-          <w:color w:val="6b7280"/>
+          <w:color w:val="6B7280"/>
           <w:sz w:val="18"/>
           <w:szCs w:val="18"/>
-          <w:rFonts w:ascii="Calibri Light" w:cs="Calibri Light" w:eastAsia="Calibri Light" w:hAnsi="Calibri Light"/>
-        </w:rPr>
-        <w:t xml:space="preserve">Duración: 1 año, renovable · Aplicable deducción del Impuesto de Sociedades (40%).</w:t>
+        </w:rPr>
+        <w:t>Duración: 1 año, renovable · Aplicable deducción del Impuesto de Sociedades (40%).</w:t>
       </w:r>
     </w:p>
     <w:p>
@@ -264,9 +214,8 @@
           <w:color w:val="479589"/>
           <w:sz w:val="40"/>
           <w:szCs w:val="40"/>
-          <w:rFonts w:ascii="Calibri Light" w:cs="Calibri Light" w:eastAsia="Calibri Light" w:hAnsi="Calibri Light"/>
-        </w:rPr>
-        <w:t xml:space="preserve">COMPROMISO INTEGRA</w:t>
+        </w:rPr>
+        <w:t>COMPROMISO INTEGRA</w:t>
       </w:r>
     </w:p>
     <w:p>
@@ -279,11 +228,56 @@
           <w:i/>
           <w:iCs/>
           <w:color w:val="C73E3A"/>
-          <w:sz w:val="22"/>
-          <w:szCs w:val="22"/>
-          <w:rFonts w:ascii="Calibri Light" w:cs="Calibri Light" w:eastAsia="Calibri Light" w:hAnsi="Calibri Light"/>
-        </w:rPr>
-        <w:t xml:space="preserve">"Por la Diversidad de Talento en los Equipos de trabajo"</w:t>
+        </w:rPr>
+        <w:t xml:space="preserve">"Por la </w:t>
+      </w:r>
+      <w:r>
+        <w:rPr>
+          <w:i/>
+          <w:iCs/>
+          <w:color w:val="C73E3A"/>
+        </w:rPr>
+        <w:t>d</w:t>
+      </w:r>
+      <w:r>
+        <w:rPr>
+          <w:i/>
+          <w:iCs/>
+          <w:color w:val="C73E3A"/>
+        </w:rPr>
+        <w:t xml:space="preserve">iversidad de </w:t>
+      </w:r>
+      <w:r>
+        <w:rPr>
+          <w:i/>
+          <w:iCs/>
+          <w:color w:val="C73E3A"/>
+        </w:rPr>
+        <w:t>t</w:t>
+      </w:r>
+      <w:r>
+        <w:rPr>
+          <w:i/>
+          <w:iCs/>
+          <w:color w:val="C73E3A"/>
+        </w:rPr>
+        <w:t xml:space="preserve">alento en los </w:t>
+      </w:r>
+      <w:r>
+        <w:rPr>
+          <w:i/>
+          <w:iCs/>
+          <w:color w:val="C73E3A"/>
+        </w:rPr>
+        <w:t>e</w:t>
+      </w:r>
+      <w:r>
+        <w:rPr>
+          <w:i/>
+          <w:iCs/>
+          <w:color w:val="C73E3A"/>
+        </w:rPr>
+        <w:t>quipos de trabajo"</w:t>
       </w:r>
     </w:p>
     <w:p>
@@ -293,10 +287,7 @@
       </w:pPr>
       <w:r>
         <w:rPr>
-          <w:color w:val="1a1a1a"/>
-          <w:sz w:val="22"/>
-          <w:szCs w:val="22"/>
-          <w:rFonts w:ascii="Calibri Light" w:cs="Calibri Light" w:eastAsia="Calibri Light" w:hAnsi="Calibri Light"/>
+          <w:color w:val="1A1A1A"/>
         </w:rPr>
         <w:t xml:space="preserve">Con la puesta en marcha de esta iniciativa, </w:t>
       </w:r>
@@ -304,19 +295,13 @@
         <w:rPr>
           <w:b/>
           <w:bCs/>
-          <w:color w:val="1a1a1a"/>
-          <w:sz w:val="22"/>
-          <w:szCs w:val="22"/>
-          <w:rFonts w:ascii="Calibri Light" w:cs="Calibri Light" w:eastAsia="Calibri Light" w:hAnsi="Calibri Light"/>
-        </w:rPr>
-        <w:t xml:space="preserve">{{NOMBRE_EMPRESA}}</w:t>
-      </w:r>
-      <w:r>
-        <w:rPr>
-          <w:color w:val="1a1a1a"/>
-          <w:sz w:val="22"/>
-          <w:szCs w:val="22"/>
-          <w:rFonts w:ascii="Calibri Light" w:cs="Calibri Light" w:eastAsia="Calibri Light" w:hAnsi="Calibri Light"/>
+          <w:color w:val="1A1A1A"/>
+        </w:rPr>
+        <w:t>{{NOMBRE_EMPRESA}}</w:t>
+      </w:r>
+      <w:r>
+        <w:rPr>
+          <w:color w:val="1A1A1A"/>
         </w:rPr>
         <w:t xml:space="preserve"> entra a formar parte de </w:t>
       </w:r>
@@ -325,18 +310,12 @@
           <w:b/>
           <w:bCs/>
           <w:color w:val="479589"/>
-          <w:sz w:val="22"/>
-          <w:szCs w:val="22"/>
-          <w:rFonts w:ascii="Calibri Light" w:cs="Calibri Light" w:eastAsia="Calibri Light" w:hAnsi="Calibri Light"/>
-        </w:rPr>
-        <w:t xml:space="preserve">Compromiso Integra</w:t>
-      </w:r>
-      <w:r>
-        <w:rPr>
-          <w:color w:val="1a1a1a"/>
-          <w:sz w:val="22"/>
-          <w:szCs w:val="22"/>
-          <w:rFonts w:ascii="Calibri Light" w:cs="Calibri Light" w:eastAsia="Calibri Light" w:hAnsi="Calibri Light"/>
+        </w:rPr>
+        <w:t>Compromiso Integra</w:t>
+      </w:r>
+      <w:r>
+        <w:rPr>
+          <w:color w:val="1A1A1A"/>
         </w:rPr>
         <w:t xml:space="preserve">: red de empresas de primer nivel que apuestan por la creación de valor social a través del empleo socialmente responsable </w:t>
       </w:r>
@@ -344,27 +323,21 @@
         <w:rPr>
           <w:b/>
           <w:bCs/>
-          <w:color w:val="1a1a1a"/>
-          <w:sz w:val="22"/>
-          <w:szCs w:val="22"/>
-          <w:rFonts w:ascii="Calibri Light" w:cs="Calibri Light" w:eastAsia="Calibri Light" w:hAnsi="Calibri Light"/>
-        </w:rPr>
-        <w:t xml:space="preserve">(ESG)</w:t>
-      </w:r>
-      <w:r>
-        <w:rPr>
-          <w:color w:val="1a1a1a"/>
-          <w:sz w:val="22"/>
-          <w:szCs w:val="22"/>
-          <w:rFonts w:ascii="Calibri Light" w:cs="Calibri Light" w:eastAsia="Calibri Light" w:hAnsi="Calibri Light"/>
-        </w:rPr>
-        <w:t xml:space="preserve">.</w:t>
+          <w:color w:val="1A1A1A"/>
+        </w:rPr>
+        <w:t>(ESG)</w:t>
+      </w:r>
+      <w:r>
+        <w:rPr>
+          <w:color w:val="1A1A1A"/>
+        </w:rPr>
+        <w:t>.</w:t>
       </w:r>
     </w:p>
     <w:p>
       <w:pPr>
         <w:pBdr>
-          <w:bottom w:val="single" w:color="479589" w:sz="8" w:space="4"/>
+          <w:bottom w:val="single" w:sz="8" w:space="4" w:color="479589"/>
         </w:pBdr>
         <w:spacing w:before="200" w:after="120"/>
       </w:pPr>
@@ -375,9 +348,8 @@
           <w:color w:val="479589"/>
           <w:sz w:val="24"/>
           <w:szCs w:val="24"/>
-          <w:rFonts w:ascii="Calibri Light" w:cs="Calibri Light" w:eastAsia="Calibri Light" w:hAnsi="Calibri Light"/>
-        </w:rPr>
-        <w:t xml:space="preserve">RED COMPROMISO INTEGRA</w:t>
+        </w:rPr>
+        <w:t>RED COMPROMISO INTEGRA</w:t>
       </w:r>
     </w:p>
     <w:p>
@@ -386,11 +358,14 @@
         <w:jc w:val="center"/>
       </w:pPr>
       <w:r>
+        <w:rPr>
+          <w:noProof/>
+        </w:rPr>
         <w:drawing>
-          <wp:inline distT="0" distB="0" distL="0" distR="0">
+          <wp:inline distT="0" distB="0" distL="0" distR="0" wp14:anchorId="2168468C" wp14:editId="38673B22">
             <wp:extent cx="4953000" cy="2600325"/>
-            <wp:effectExtent t="0" r="0" b="0" l="0"/>
-            <wp:docPr id="1" name="" descr="" title=""/>
+            <wp:effectExtent l="0" t="0" r="0" b="0"/>
+            <wp:docPr id="1" name="Imagen 1"/>
             <wp:cNvGraphicFramePr>
               <a:graphicFrameLocks xmlns:a="http://schemas.openxmlformats.org/drawingml/2006/main" noChangeAspect="1"/>
             </wp:cNvGraphicFramePr>
@@ -398,13 +373,13 @@
               <a:graphicData uri="http://schemas.openxmlformats.org/drawingml/2006/picture">
                 <pic:pic xmlns:pic="http://schemas.openxmlformats.org/drawingml/2006/picture">
                   <pic:nvPicPr>
-                    <pic:cNvPr id="0" name="" descr=""/>
+                    <pic:cNvPr id="0" name=""/>
                     <pic:cNvPicPr>
                       <a:picLocks noChangeAspect="1" noChangeArrowheads="1"/>
                     </pic:cNvPicPr>
                   </pic:nvPicPr>
                   <pic:blipFill>
-                    <a:blip r:embed="rId7" cstate="none"/>
+                    <a:blip r:embed="rId7"/>
                     <a:srcRect/>
                     <a:stretch>
                       <a:fillRect/>
@@ -429,7 +404,7 @@
     <w:p>
       <w:pPr>
         <w:pBdr>
-          <w:bottom w:val="single" w:color="479589" w:sz="8" w:space="4"/>
+          <w:bottom w:val="single" w:sz="8" w:space="4" w:color="479589"/>
         </w:pBdr>
         <w:spacing w:before="200" w:after="120"/>
       </w:pPr>
@@ -440,9 +415,8 @@
           <w:color w:val="479589"/>
           <w:sz w:val="24"/>
           <w:szCs w:val="24"/>
-          <w:rFonts w:ascii="Calibri Light" w:cs="Calibri Light" w:eastAsia="Calibri Light" w:hAnsi="Calibri Light"/>
-        </w:rPr>
-        <w:t xml:space="preserve">AGENDA 2030 · DIMENSIÓN SOCIAL ESG</w:t>
+        </w:rPr>
+        <w:t>AGENDA 2030 · DIMENSIÓN SOCIAL ESG</w:t>
       </w:r>
     </w:p>
     <w:p>
@@ -452,30 +426,22 @@
       </w:pPr>
       <w:r>
         <w:rPr>
-          <w:color w:val="1a1a1a"/>
-          <w:sz w:val="22"/>
-          <w:szCs w:val="22"/>
-          <w:rFonts w:ascii="Calibri Light" w:cs="Calibri Light" w:eastAsia="Calibri Light" w:hAnsi="Calibri Light"/>
-        </w:rPr>
+          <w:color w:val="1A1A1A"/>
+        </w:rPr>
+        <w:lastRenderedPageBreak/>
         <w:t xml:space="preserve">Esta propuesta contribuye al cumplimiento de los </w:t>
       </w:r>
       <w:r>
         <w:rPr>
           <w:b/>
           <w:bCs/>
-          <w:color w:val="1a1a1a"/>
-          <w:sz w:val="22"/>
-          <w:szCs w:val="22"/>
-          <w:rFonts w:ascii="Calibri Light" w:cs="Calibri Light" w:eastAsia="Calibri Light" w:hAnsi="Calibri Light"/>
-        </w:rPr>
-        <w:t xml:space="preserve">Objetivos de Desarrollo Sostenible</w:t>
-      </w:r>
-      <w:r>
-        <w:rPr>
-          <w:color w:val="1a1a1a"/>
-          <w:sz w:val="22"/>
-          <w:szCs w:val="22"/>
-          <w:rFonts w:ascii="Calibri Light" w:cs="Calibri Light" w:eastAsia="Calibri Light" w:hAnsi="Calibri Light"/>
+          <w:color w:val="1A1A1A"/>
+        </w:rPr>
+        <w:t>Objetivos de Desarrollo Sostenible</w:t>
+      </w:r>
+      <w:r>
+        <w:rPr>
+          <w:color w:val="1A1A1A"/>
         </w:rPr>
         <w:t xml:space="preserve"> de la Agenda 2030 y a mejorar la clasificación ESG en la </w:t>
       </w:r>
@@ -484,18 +450,12 @@
           <w:b/>
           <w:bCs/>
           <w:color w:val="479589"/>
-          <w:sz w:val="22"/>
-          <w:szCs w:val="22"/>
-          <w:rFonts w:ascii="Calibri Light" w:cs="Calibri Light" w:eastAsia="Calibri Light" w:hAnsi="Calibri Light"/>
-        </w:rPr>
-        <w:t xml:space="preserve">Dimensión Social</w:t>
-      </w:r>
-      <w:r>
-        <w:rPr>
-          <w:color w:val="1a1a1a"/>
-          <w:sz w:val="22"/>
-          <w:szCs w:val="22"/>
-          <w:rFonts w:ascii="Calibri Light" w:cs="Calibri Light" w:eastAsia="Calibri Light" w:hAnsi="Calibri Light"/>
+        </w:rPr>
+        <w:t>Dimensión Social</w:t>
+      </w:r>
+      <w:r>
+        <w:rPr>
+          <w:color w:val="1A1A1A"/>
         </w:rPr>
         <w:t xml:space="preserve"> de </w:t>
       </w:r>
@@ -503,21 +463,15 @@
         <w:rPr>
           <w:b/>
           <w:bCs/>
-          <w:color w:val="1a1a1a"/>
-          <w:sz w:val="22"/>
-          <w:szCs w:val="22"/>
-          <w:rFonts w:ascii="Calibri Light" w:cs="Calibri Light" w:eastAsia="Calibri Light" w:hAnsi="Calibri Light"/>
-        </w:rPr>
-        <w:t xml:space="preserve">{{NOMBRE_EMPRESA}}</w:t>
-      </w:r>
-      <w:r>
-        <w:rPr>
-          <w:color w:val="1a1a1a"/>
-          <w:sz w:val="22"/>
-          <w:szCs w:val="22"/>
-          <w:rFonts w:ascii="Calibri Light" w:cs="Calibri Light" w:eastAsia="Calibri Light" w:hAnsi="Calibri Light"/>
-        </w:rPr>
-        <w:t xml:space="preserve">.</w:t>
+          <w:color w:val="1A1A1A"/>
+        </w:rPr>
+        <w:t>{{NOMBRE_EMPRESA}}</w:t>
+      </w:r>
+      <w:r>
+        <w:rPr>
+          <w:color w:val="1A1A1A"/>
+        </w:rPr>
+        <w:t>.</w:t>
       </w:r>
     </w:p>
     <w:p>
@@ -526,11 +480,14 @@
         <w:jc w:val="center"/>
       </w:pPr>
       <w:r>
+        <w:rPr>
+          <w:noProof/>
+        </w:rPr>
         <w:drawing>
-          <wp:inline distT="0" distB="0" distL="0" distR="0">
+          <wp:inline distT="0" distB="0" distL="0" distR="0" wp14:anchorId="6B544BC2" wp14:editId="1BEB4B76">
             <wp:extent cx="3429000" cy="590550"/>
-            <wp:effectExtent t="0" r="0" b="0" l="0"/>
-            <wp:docPr id="1" name="" descr="" title=""/>
+            <wp:effectExtent l="0" t="0" r="0" b="0"/>
+            <wp:docPr id="318458777" name="Imagen 318458777"/>
             <wp:cNvGraphicFramePr>
               <a:graphicFrameLocks xmlns:a="http://schemas.openxmlformats.org/drawingml/2006/main" noChangeAspect="1"/>
             </wp:cNvGraphicFramePr>
@@ -538,13 +495,13 @@
               <a:graphicData uri="http://schemas.openxmlformats.org/drawingml/2006/picture">
                 <pic:pic xmlns:pic="http://schemas.openxmlformats.org/drawingml/2006/picture">
                   <pic:nvPicPr>
-                    <pic:cNvPr id="0" name="" descr=""/>
+                    <pic:cNvPr id="0" name=""/>
                     <pic:cNvPicPr>
                       <a:picLocks noChangeAspect="1" noChangeArrowheads="1"/>
                     </pic:cNvPicPr>
                   </pic:nvPicPr>
                   <pic:blipFill>
-                    <a:blip r:embed="rId8" cstate="none"/>
+                    <a:blip r:embed="rId8"/>
                     <a:srcRect/>
                     <a:stretch>
                       <a:fillRect/>
@@ -572,11 +529,14 @@
         <w:jc w:val="center"/>
       </w:pPr>
       <w:r>
+        <w:rPr>
+          <w:noProof/>
+        </w:rPr>
         <w:drawing>
-          <wp:inline distT="0" distB="0" distL="0" distR="0">
+          <wp:inline distT="0" distB="0" distL="0" distR="0" wp14:anchorId="2CBABC9E" wp14:editId="12E2CF92">
             <wp:extent cx="2667000" cy="781050"/>
-            <wp:effectExtent t="0" r="0" b="0" l="0"/>
-            <wp:docPr id="1" name="" descr="" title=""/>
+            <wp:effectExtent l="0" t="0" r="0" b="0"/>
+            <wp:docPr id="1402466833" name="Imagen 1402466833"/>
             <wp:cNvGraphicFramePr>
               <a:graphicFrameLocks xmlns:a="http://schemas.openxmlformats.org/drawingml/2006/main" noChangeAspect="1"/>
             </wp:cNvGraphicFramePr>
@@ -584,13 +544,13 @@
               <a:graphicData uri="http://schemas.openxmlformats.org/drawingml/2006/picture">
                 <pic:pic xmlns:pic="http://schemas.openxmlformats.org/drawingml/2006/picture">
                   <pic:nvPicPr>
-                    <pic:cNvPr id="0" name="" descr=""/>
+                    <pic:cNvPr id="0" name=""/>
                     <pic:cNvPicPr>
                       <a:picLocks noChangeAspect="1" noChangeArrowheads="1"/>
                     </pic:cNvPicPr>
                   </pic:nvPicPr>
                   <pic:blipFill>
-                    <a:blip r:embed="rId9" cstate="none"/>
+                    <a:blip r:embed="rId9"/>
                     <a:srcRect/>
                     <a:stretch>
                       <a:fillRect/>
@@ -629,9 +589,9 @@
           <w:color w:val="479589"/>
           <w:sz w:val="40"/>
           <w:szCs w:val="40"/>
-          <w:rFonts w:ascii="Calibri Light" w:cs="Calibri Light" w:eastAsia="Calibri Light" w:hAnsi="Calibri Light"/>
-        </w:rPr>
-        <w:t xml:space="preserve">ACCIONES CONJUNTAS</w:t>
+        </w:rPr>
+        <w:lastRenderedPageBreak/>
+        <w:t>ACCIONES CONJUNTAS</w:t>
       </w:r>
     </w:p>
     <w:p>
@@ -643,10 +603,7 @@
         <w:rPr>
           <w:i/>
           <w:iCs/>
-          <w:color w:val="6b7280"/>
-          <w:sz w:val="22"/>
-          <w:szCs w:val="22"/>
-          <w:rFonts w:ascii="Calibri Light" w:cs="Calibri Light" w:eastAsia="Calibri Light" w:hAnsi="Calibri Light"/>
+          <w:color w:val="6B7280"/>
         </w:rPr>
         <w:t xml:space="preserve">Propuesta de colaboración con </w:t>
       </w:r>
@@ -656,12 +613,9 @@
           <w:bCs/>
           <w:i/>
           <w:iCs/>
-          <w:color w:val="6b7280"/>
-          <w:sz w:val="22"/>
-          <w:szCs w:val="22"/>
-          <w:rFonts w:ascii="Calibri Light" w:cs="Calibri Light" w:eastAsia="Calibri Light" w:hAnsi="Calibri Light"/>
-        </w:rPr>
-        <w:t xml:space="preserve">{{NOMBRE_EMPRESA}}</w:t>
+          <w:color w:val="6B7280"/>
+        </w:rPr>
+        <w:t>{{NOMBRE_EMPRESA}}</w:t>
       </w:r>
     </w:p>
     <w:p>
@@ -673,11 +627,8 @@
           <w:b/>
           <w:bCs/>
           <w:color w:val="C73E3A"/>
-          <w:sz w:val="22"/>
-          <w:szCs w:val="22"/>
-          <w:rFonts w:ascii="Calibri Light" w:cs="Calibri Light" w:eastAsia="Calibri Light" w:hAnsi="Calibri Light"/>
-        </w:rPr>
-        <w:t xml:space="preserve">Reclutamiento y selección inclusiva</w:t>
+        </w:rPr>
+        <w:t>Reclutamiento y selección inclusiva</w:t>
       </w:r>
     </w:p>
     <w:p>
@@ -687,12 +638,9 @@
       </w:pPr>
       <w:r>
         <w:rPr>
-          <w:color w:val="1a1a1a"/>
-          <w:sz w:val="22"/>
-          <w:szCs w:val="22"/>
-          <w:rFonts w:ascii="Calibri Light" w:cs="Calibri Light" w:eastAsia="Calibri Light" w:hAnsi="Calibri Light"/>
-        </w:rPr>
-        <w:t xml:space="preserve">Ofrecemos un servicio ilimitado para favorecer la integración de personas en exclusión social (mujeres víctimas de violencia, personas sin hogar, ex reclusos, ex drogodependientes…) y personas con discapacidad en los equipos de trabajo.</w:t>
+          <w:color w:val="1A1A1A"/>
+        </w:rPr>
+        <w:t>Ofrecemos un servicio ilimitado para favorecer la integración de personas en exclusión social (mujeres víctimas de violencia, personas sin hogar, ex reclusos, ex drogodependientes…) y personas con discapacidad en los equipos de trabajo.</w:t>
       </w:r>
     </w:p>
     <w:p>
@@ -705,9 +653,6 @@
           <w:b/>
           <w:bCs/>
           <w:color w:val="C73E3A"/>
-          <w:sz w:val="22"/>
-          <w:szCs w:val="22"/>
-          <w:rFonts w:ascii="Calibri Light" w:cs="Calibri Light" w:eastAsia="Calibri Light" w:hAnsi="Calibri Light"/>
         </w:rPr>
         <w:t xml:space="preserve">• </w:t>
       </w:r>
@@ -715,21 +660,15 @@
         <w:rPr>
           <w:b/>
           <w:bCs/>
-          <w:color w:val="1a1a1a"/>
-          <w:sz w:val="22"/>
-          <w:szCs w:val="22"/>
-          <w:rFonts w:ascii="Calibri Light" w:cs="Calibri Light" w:eastAsia="Calibri Light" w:hAnsi="Calibri Light"/>
-        </w:rPr>
-        <w:t xml:space="preserve">Reclutamiento</w:t>
-      </w:r>
-      <w:r>
-        <w:rPr>
-          <w:color w:val="1a1a1a"/>
-          <w:sz w:val="22"/>
-          <w:szCs w:val="22"/>
-          <w:rFonts w:ascii="Calibri Light" w:cs="Calibri Light" w:eastAsia="Calibri Light" w:hAnsi="Calibri Light"/>
-        </w:rPr>
-        <w:t xml:space="preserve">, valoración y selección de candidatos.</w:t>
+          <w:color w:val="1A1A1A"/>
+        </w:rPr>
+        <w:t>Reclutamiento</w:t>
+      </w:r>
+      <w:r>
+        <w:rPr>
+          <w:color w:val="1A1A1A"/>
+        </w:rPr>
+        <w:t>, valoración y selección de candidatos.</w:t>
       </w:r>
     </w:p>
     <w:p>
@@ -742,9 +681,6 @@
           <w:b/>
           <w:bCs/>
           <w:color w:val="C73E3A"/>
-          <w:sz w:val="22"/>
-          <w:szCs w:val="22"/>
-          <w:rFonts w:ascii="Calibri Light" w:cs="Calibri Light" w:eastAsia="Calibri Light" w:hAnsi="Calibri Light"/>
         </w:rPr>
         <w:t xml:space="preserve">• </w:t>
       </w:r>
@@ -752,19 +688,13 @@
         <w:rPr>
           <w:b/>
           <w:bCs/>
-          <w:color w:val="1a1a1a"/>
-          <w:sz w:val="22"/>
-          <w:szCs w:val="22"/>
-          <w:rFonts w:ascii="Calibri Light" w:cs="Calibri Light" w:eastAsia="Calibri Light" w:hAnsi="Calibri Light"/>
-        </w:rPr>
-        <w:t xml:space="preserve">Derivación de candidatos</w:t>
-      </w:r>
-      <w:r>
-        <w:rPr>
-          <w:color w:val="1a1a1a"/>
-          <w:sz w:val="22"/>
-          <w:szCs w:val="22"/>
-          <w:rFonts w:ascii="Calibri Light" w:cs="Calibri Light" w:eastAsia="Calibri Light" w:hAnsi="Calibri Light"/>
+          <w:color w:val="1A1A1A"/>
+        </w:rPr>
+        <w:t>Derivación de candidatos</w:t>
+      </w:r>
+      <w:r>
+        <w:rPr>
+          <w:color w:val="1A1A1A"/>
         </w:rPr>
         <w:t xml:space="preserve"> a ofertas asegurando ajuste perfil-puesto.</w:t>
       </w:r>
@@ -779,9 +709,6 @@
           <w:b/>
           <w:bCs/>
           <w:color w:val="C73E3A"/>
-          <w:sz w:val="22"/>
-          <w:szCs w:val="22"/>
-          <w:rFonts w:ascii="Calibri Light" w:cs="Calibri Light" w:eastAsia="Calibri Light" w:hAnsi="Calibri Light"/>
         </w:rPr>
         <w:t xml:space="preserve">• </w:t>
       </w:r>
@@ -789,19 +716,13 @@
         <w:rPr>
           <w:b/>
           <w:bCs/>
-          <w:color w:val="1a1a1a"/>
-          <w:sz w:val="22"/>
-          <w:szCs w:val="22"/>
-          <w:rFonts w:ascii="Calibri Light" w:cs="Calibri Light" w:eastAsia="Calibri Light" w:hAnsi="Calibri Light"/>
-        </w:rPr>
-        <w:t xml:space="preserve">Envío de bolsas de candidatos</w:t>
-      </w:r>
-      <w:r>
-        <w:rPr>
-          <w:color w:val="1a1a1a"/>
-          <w:sz w:val="22"/>
-          <w:szCs w:val="22"/>
-          <w:rFonts w:ascii="Calibri Light" w:cs="Calibri Light" w:eastAsia="Calibri Light" w:hAnsi="Calibri Light"/>
+          <w:color w:val="1A1A1A"/>
+        </w:rPr>
+        <w:t>Envío de bolsas de candidatos</w:t>
+      </w:r>
+      <w:r>
+        <w:rPr>
+          <w:color w:val="1A1A1A"/>
         </w:rPr>
         <w:t xml:space="preserve"> con perfiles recurrentes.</w:t>
       </w:r>
@@ -816,9 +737,6 @@
           <w:b/>
           <w:bCs/>
           <w:color w:val="C73E3A"/>
-          <w:sz w:val="22"/>
-          <w:szCs w:val="22"/>
-          <w:rFonts w:ascii="Calibri Light" w:cs="Calibri Light" w:eastAsia="Calibri Light" w:hAnsi="Calibri Light"/>
         </w:rPr>
         <w:t xml:space="preserve">• </w:t>
       </w:r>
@@ -826,19 +744,13 @@
         <w:rPr>
           <w:b/>
           <w:bCs/>
-          <w:color w:val="1a1a1a"/>
-          <w:sz w:val="22"/>
-          <w:szCs w:val="22"/>
-          <w:rFonts w:ascii="Calibri Light" w:cs="Calibri Light" w:eastAsia="Calibri Light" w:hAnsi="Calibri Light"/>
-        </w:rPr>
-        <w:t xml:space="preserve">Citación a entrevista</w:t>
-      </w:r>
-      <w:r>
-        <w:rPr>
-          <w:color w:val="1a1a1a"/>
-          <w:sz w:val="22"/>
-          <w:szCs w:val="22"/>
-          <w:rFonts w:ascii="Calibri Light" w:cs="Calibri Light" w:eastAsia="Calibri Light" w:hAnsi="Calibri Light"/>
+          <w:color w:val="1A1A1A"/>
+        </w:rPr>
+        <w:t>Citación a entrevista</w:t>
+      </w:r>
+      <w:r>
+        <w:rPr>
+          <w:color w:val="1A1A1A"/>
         </w:rPr>
         <w:t xml:space="preserve"> de los candidatos seleccionados.</w:t>
       </w:r>
@@ -853,9 +765,6 @@
           <w:b/>
           <w:bCs/>
           <w:color w:val="C73E3A"/>
-          <w:sz w:val="22"/>
-          <w:szCs w:val="22"/>
-          <w:rFonts w:ascii="Calibri Light" w:cs="Calibri Light" w:eastAsia="Calibri Light" w:hAnsi="Calibri Light"/>
         </w:rPr>
         <w:t xml:space="preserve">• </w:t>
       </w:r>
@@ -863,19 +772,13 @@
         <w:rPr>
           <w:b/>
           <w:bCs/>
-          <w:color w:val="1a1a1a"/>
-          <w:sz w:val="22"/>
-          <w:szCs w:val="22"/>
-          <w:rFonts w:ascii="Calibri Light" w:cs="Calibri Light" w:eastAsia="Calibri Light" w:hAnsi="Calibri Light"/>
-        </w:rPr>
-        <w:t xml:space="preserve">Seguimiento</w:t>
-      </w:r>
-      <w:r>
-        <w:rPr>
-          <w:color w:val="1a1a1a"/>
-          <w:sz w:val="22"/>
-          <w:szCs w:val="22"/>
-          <w:rFonts w:ascii="Calibri Light" w:cs="Calibri Light" w:eastAsia="Calibri Light" w:hAnsi="Calibri Light"/>
+          <w:color w:val="1A1A1A"/>
+        </w:rPr>
+        <w:t>Seguimiento</w:t>
+      </w:r>
+      <w:r>
+        <w:rPr>
+          <w:color w:val="1A1A1A"/>
         </w:rPr>
         <w:t xml:space="preserve"> de los procesos de selección y post contratación.</w:t>
       </w:r>
@@ -889,11 +792,8 @@
           <w:b/>
           <w:bCs/>
           <w:color w:val="C73E3A"/>
-          <w:sz w:val="22"/>
-          <w:szCs w:val="22"/>
-          <w:rFonts w:ascii="Calibri Light" w:cs="Calibri Light" w:eastAsia="Calibri Light" w:hAnsi="Calibri Light"/>
-        </w:rPr>
-        <w:t xml:space="preserve">Voluntariado corporativo y formación</w:t>
+        </w:rPr>
+        <w:t>Voluntariado corporativo y formación</w:t>
       </w:r>
     </w:p>
     <w:p>
@@ -903,12 +803,9 @@
       </w:pPr>
       <w:r>
         <w:rPr>
-          <w:color w:val="1a1a1a"/>
-          <w:sz w:val="22"/>
-          <w:szCs w:val="22"/>
-          <w:rFonts w:ascii="Calibri Light" w:cs="Calibri Light" w:eastAsia="Calibri Light" w:hAnsi="Calibri Light"/>
-        </w:rPr>
-        <w:t xml:space="preserve">Promovemos la participación y compromiso de los empleados a través de actividades de voluntariado con beneficiarios de la Fundación, como herramienta de mejora de la empleabilidad y de atracción y retención de talento.</w:t>
+          <w:color w:val="1A1A1A"/>
+        </w:rPr>
+        <w:t>Promovemos la participación y compromiso de los empleados a través de actividades de voluntariado con beneficiarios de la Fundación, como herramienta de mejora de la empleabilidad y de atracción y retención de talento.</w:t>
       </w:r>
     </w:p>
     <w:p>
@@ -921,9 +818,6 @@
           <w:b/>
           <w:bCs/>
           <w:color w:val="C73E3A"/>
-          <w:sz w:val="22"/>
-          <w:szCs w:val="22"/>
-          <w:rFonts w:ascii="Calibri Light" w:cs="Calibri Light" w:eastAsia="Calibri Light" w:hAnsi="Calibri Light"/>
         </w:rPr>
         <w:t xml:space="preserve">• </w:t>
       </w:r>
@@ -931,19 +825,13 @@
         <w:rPr>
           <w:b/>
           <w:bCs/>
-          <w:color w:val="1a1a1a"/>
-          <w:sz w:val="22"/>
-          <w:szCs w:val="22"/>
-          <w:rFonts w:ascii="Calibri Light" w:cs="Calibri Light" w:eastAsia="Calibri Light" w:hAnsi="Calibri Light"/>
-        </w:rPr>
-        <w:t xml:space="preserve">Escuela de Fortalecimiento:</w:t>
-      </w:r>
-      <w:r>
-        <w:rPr>
-          <w:color w:val="1a1a1a"/>
-          <w:sz w:val="22"/>
-          <w:szCs w:val="22"/>
-          <w:rFonts w:ascii="Calibri Light" w:cs="Calibri Light" w:eastAsia="Calibri Light" w:hAnsi="Calibri Light"/>
+          <w:color w:val="1A1A1A"/>
+        </w:rPr>
+        <w:t>Escuela de Fortalecimiento:</w:t>
+      </w:r>
+      <w:r>
+        <w:rPr>
+          <w:color w:val="1A1A1A"/>
         </w:rPr>
         <w:t xml:space="preserve"> programa integral de formación prelaboral que mejora la empleabilidad de los candidatos.</w:t>
       </w:r>
@@ -958,9 +846,6 @@
           <w:b/>
           <w:bCs/>
           <w:color w:val="C73E3A"/>
-          <w:sz w:val="22"/>
-          <w:szCs w:val="22"/>
-          <w:rFonts w:ascii="Calibri Light" w:cs="Calibri Light" w:eastAsia="Calibri Light" w:hAnsi="Calibri Light"/>
         </w:rPr>
         <w:t xml:space="preserve">• </w:t>
       </w:r>
@@ -968,19 +853,13 @@
         <w:rPr>
           <w:b/>
           <w:bCs/>
-          <w:color w:val="1a1a1a"/>
-          <w:sz w:val="22"/>
-          <w:szCs w:val="22"/>
-          <w:rFonts w:ascii="Calibri Light" w:cs="Calibri Light" w:eastAsia="Calibri Light" w:hAnsi="Calibri Light"/>
-        </w:rPr>
-        <w:t xml:space="preserve">Integra-Te:</w:t>
-      </w:r>
-      <w:r>
-        <w:rPr>
-          <w:color w:val="1a1a1a"/>
-          <w:sz w:val="22"/>
-          <w:szCs w:val="22"/>
-          <w:rFonts w:ascii="Calibri Light" w:cs="Calibri Light" w:eastAsia="Calibri Light" w:hAnsi="Calibri Light"/>
+          <w:color w:val="1A1A1A"/>
+        </w:rPr>
+        <w:t>Integra-Te:</w:t>
+      </w:r>
+      <w:r>
+        <w:rPr>
+          <w:color w:val="1A1A1A"/>
         </w:rPr>
         <w:t xml:space="preserve"> programa de inmersión práctica enfocado en competencias básicas para la búsqueda de empleo.</w:t>
       </w:r>
@@ -994,11 +873,8 @@
           <w:b/>
           <w:bCs/>
           <w:color w:val="C73E3A"/>
-          <w:sz w:val="22"/>
-          <w:szCs w:val="22"/>
-          <w:rFonts w:ascii="Calibri Light" w:cs="Calibri Light" w:eastAsia="Calibri Light" w:hAnsi="Calibri Light"/>
-        </w:rPr>
-        <w:t xml:space="preserve">Transformación cultural e igualdad corporativa</w:t>
+        </w:rPr>
+        <w:t>Transformación cultural e igualdad corporativa</w:t>
       </w:r>
     </w:p>
     <w:p>
@@ -1011,9 +887,6 @@
           <w:b/>
           <w:bCs/>
           <w:color w:val="C73E3A"/>
-          <w:sz w:val="22"/>
-          <w:szCs w:val="22"/>
-          <w:rFonts w:ascii="Calibri Light" w:cs="Calibri Light" w:eastAsia="Calibri Light" w:hAnsi="Calibri Light"/>
         </w:rPr>
         <w:t xml:space="preserve">• </w:t>
       </w:r>
@@ -1021,19 +894,13 @@
         <w:rPr>
           <w:b/>
           <w:bCs/>
-          <w:color w:val="1a1a1a"/>
-          <w:sz w:val="22"/>
-          <w:szCs w:val="22"/>
-          <w:rFonts w:ascii="Calibri Light" w:cs="Calibri Light" w:eastAsia="Calibri Light" w:hAnsi="Calibri Light"/>
-        </w:rPr>
-        <w:t xml:space="preserve">Jornadas de sensibilización</w:t>
-      </w:r>
-      <w:r>
-        <w:rPr>
-          <w:color w:val="1a1a1a"/>
-          <w:sz w:val="22"/>
-          <w:szCs w:val="22"/>
-          <w:rFonts w:ascii="Calibri Light" w:cs="Calibri Light" w:eastAsia="Calibri Light" w:hAnsi="Calibri Light"/>
+          <w:color w:val="1A1A1A"/>
+        </w:rPr>
+        <w:t>Jornadas de sensibilización</w:t>
+      </w:r>
+      <w:r>
+        <w:rPr>
+          <w:color w:val="1A1A1A"/>
         </w:rPr>
         <w:t xml:space="preserve"> para directivos, mandos intermedios y empleados.</w:t>
       </w:r>
@@ -1048,9 +915,6 @@
           <w:b/>
           <w:bCs/>
           <w:color w:val="C73E3A"/>
-          <w:sz w:val="22"/>
-          <w:szCs w:val="22"/>
-          <w:rFonts w:ascii="Calibri Light" w:cs="Calibri Light" w:eastAsia="Calibri Light" w:hAnsi="Calibri Light"/>
         </w:rPr>
         <w:t xml:space="preserve">• </w:t>
       </w:r>
@@ -1058,19 +922,13 @@
         <w:rPr>
           <w:b/>
           <w:bCs/>
-          <w:color w:val="1a1a1a"/>
-          <w:sz w:val="22"/>
-          <w:szCs w:val="22"/>
-          <w:rFonts w:ascii="Calibri Light" w:cs="Calibri Light" w:eastAsia="Calibri Light" w:hAnsi="Calibri Light"/>
-        </w:rPr>
-        <w:t xml:space="preserve">Talleres experienciales</w:t>
-      </w:r>
-      <w:r>
-        <w:rPr>
-          <w:color w:val="1a1a1a"/>
-          <w:sz w:val="22"/>
-          <w:szCs w:val="22"/>
-          <w:rFonts w:ascii="Calibri Light" w:cs="Calibri Light" w:eastAsia="Calibri Light" w:hAnsi="Calibri Light"/>
+          <w:color w:val="1A1A1A"/>
+        </w:rPr>
+        <w:t>Talleres experienciales</w:t>
+      </w:r>
+      <w:r>
+        <w:rPr>
+          <w:color w:val="1A1A1A"/>
         </w:rPr>
         <w:t xml:space="preserve"> para favorecer la eliminación de barreras y prejuicios.</w:t>
       </w:r>
@@ -1085,9 +943,6 @@
           <w:b/>
           <w:bCs/>
           <w:color w:val="C73E3A"/>
-          <w:sz w:val="22"/>
-          <w:szCs w:val="22"/>
-          <w:rFonts w:ascii="Calibri Light" w:cs="Calibri Light" w:eastAsia="Calibri Light" w:hAnsi="Calibri Light"/>
         </w:rPr>
         <w:t xml:space="preserve">• </w:t>
       </w:r>
@@ -1095,19 +950,13 @@
         <w:rPr>
           <w:b/>
           <w:bCs/>
-          <w:color w:val="1a1a1a"/>
-          <w:sz w:val="22"/>
-          <w:szCs w:val="22"/>
-          <w:rFonts w:ascii="Calibri Light" w:cs="Calibri Light" w:eastAsia="Calibri Light" w:hAnsi="Calibri Light"/>
-        </w:rPr>
-        <w:t xml:space="preserve">Campañas de concienciación</w:t>
-      </w:r>
-      <w:r>
-        <w:rPr>
-          <w:color w:val="1a1a1a"/>
-          <w:sz w:val="22"/>
-          <w:szCs w:val="22"/>
-          <w:rFonts w:ascii="Calibri Light" w:cs="Calibri Light" w:eastAsia="Calibri Light" w:hAnsi="Calibri Light"/>
+          <w:color w:val="1A1A1A"/>
+        </w:rPr>
+        <w:t>Campañas de concienciación</w:t>
+      </w:r>
+      <w:r>
+        <w:rPr>
+          <w:color w:val="1A1A1A"/>
         </w:rPr>
         <w:t xml:space="preserve"> alineadas con días conmemorativos de los colectivos.</w:t>
       </w:r>
@@ -1121,11 +970,8 @@
           <w:b/>
           <w:bCs/>
           <w:color w:val="C73E3A"/>
-          <w:sz w:val="22"/>
-          <w:szCs w:val="22"/>
-          <w:rFonts w:ascii="Calibri Light" w:cs="Calibri Light" w:eastAsia="Calibri Light" w:hAnsi="Calibri Light"/>
-        </w:rPr>
-        <w:t xml:space="preserve">Imagen de marca y comunicación</w:t>
+        </w:rPr>
+        <w:t>Imagen de marca y comunicación</w:t>
       </w:r>
     </w:p>
     <w:p>
@@ -1138,9 +984,6 @@
           <w:b/>
           <w:bCs/>
           <w:color w:val="C73E3A"/>
-          <w:sz w:val="22"/>
-          <w:szCs w:val="22"/>
-          <w:rFonts w:ascii="Calibri Light" w:cs="Calibri Light" w:eastAsia="Calibri Light" w:hAnsi="Calibri Light"/>
         </w:rPr>
         <w:t xml:space="preserve">• </w:t>
       </w:r>
@@ -1148,19 +991,13 @@
         <w:rPr>
           <w:b/>
           <w:bCs/>
-          <w:color w:val="1a1a1a"/>
-          <w:sz w:val="22"/>
-          <w:szCs w:val="22"/>
-          <w:rFonts w:ascii="Calibri Light" w:cs="Calibri Light" w:eastAsia="Calibri Light" w:hAnsi="Calibri Light"/>
-        </w:rPr>
-        <w:t xml:space="preserve">Mesas de buenas prácticas, Conversaciones ESG y Paneles de expertos</w:t>
-      </w:r>
-      <w:r>
-        <w:rPr>
-          <w:color w:val="1a1a1a"/>
-          <w:sz w:val="22"/>
-          <w:szCs w:val="22"/>
-          <w:rFonts w:ascii="Calibri Light" w:cs="Calibri Light" w:eastAsia="Calibri Light" w:hAnsi="Calibri Light"/>
+          <w:color w:val="1A1A1A"/>
+        </w:rPr>
+        <w:t>Mesas de buenas prácticas, Conversaciones ESG y Paneles de expertos</w:t>
+      </w:r>
+      <w:r>
+        <w:rPr>
+          <w:color w:val="1A1A1A"/>
         </w:rPr>
         <w:t xml:space="preserve"> entre las empresas de la Red.</w:t>
       </w:r>
@@ -1175,9 +1012,6 @@
           <w:b/>
           <w:bCs/>
           <w:color w:val="C73E3A"/>
-          <w:sz w:val="22"/>
-          <w:szCs w:val="22"/>
-          <w:rFonts w:ascii="Calibri Light" w:cs="Calibri Light" w:eastAsia="Calibri Light" w:hAnsi="Calibri Light"/>
         </w:rPr>
         <w:t xml:space="preserve">• </w:t>
       </w:r>
@@ -1185,19 +1019,13 @@
         <w:rPr>
           <w:b/>
           <w:bCs/>
-          <w:color w:val="1a1a1a"/>
-          <w:sz w:val="22"/>
-          <w:szCs w:val="22"/>
-          <w:rFonts w:ascii="Calibri Light" w:cs="Calibri Light" w:eastAsia="Calibri Light" w:hAnsi="Calibri Light"/>
-        </w:rPr>
-        <w:t xml:space="preserve">Inclusión del logotipo</w:t>
-      </w:r>
-      <w:r>
-        <w:rPr>
-          <w:color w:val="1a1a1a"/>
-          <w:sz w:val="22"/>
-          <w:szCs w:val="22"/>
-          <w:rFonts w:ascii="Calibri Light" w:cs="Calibri Light" w:eastAsia="Calibri Light" w:hAnsi="Calibri Light"/>
+          <w:color w:val="1A1A1A"/>
+        </w:rPr>
+        <w:t>Inclusión del logotipo</w:t>
+      </w:r>
+      <w:r>
+        <w:rPr>
+          <w:color w:val="1A1A1A"/>
         </w:rPr>
         <w:t xml:space="preserve"> en materiales divulgativos, newsletter y memoria anual.</w:t>
       </w:r>
@@ -1212,9 +1040,6 @@
           <w:b/>
           <w:bCs/>
           <w:color w:val="C73E3A"/>
-          <w:sz w:val="22"/>
-          <w:szCs w:val="22"/>
-          <w:rFonts w:ascii="Calibri Light" w:cs="Calibri Light" w:eastAsia="Calibri Light" w:hAnsi="Calibri Light"/>
         </w:rPr>
         <w:t xml:space="preserve">• </w:t>
       </w:r>
@@ -1222,19 +1047,13 @@
         <w:rPr>
           <w:b/>
           <w:bCs/>
-          <w:color w:val="1a1a1a"/>
-          <w:sz w:val="22"/>
-          <w:szCs w:val="22"/>
-          <w:rFonts w:ascii="Calibri Light" w:cs="Calibri Light" w:eastAsia="Calibri Light" w:hAnsi="Calibri Light"/>
-        </w:rPr>
-        <w:t xml:space="preserve">Informe Anual de Huella Social (ESG)</w:t>
-      </w:r>
-      <w:r>
-        <w:rPr>
-          <w:color w:val="1a1a1a"/>
-          <w:sz w:val="22"/>
-          <w:szCs w:val="22"/>
-          <w:rFonts w:ascii="Calibri Light" w:cs="Calibri Light" w:eastAsia="Calibri Light" w:hAnsi="Calibri Light"/>
+          <w:color w:val="1A1A1A"/>
+        </w:rPr>
+        <w:t>Informe Anual de Huella Social (ESG)</w:t>
+      </w:r>
+      <w:r>
+        <w:rPr>
+          <w:color w:val="1A1A1A"/>
         </w:rPr>
         <w:t xml:space="preserve"> para dar respuesta a la normativa CSRD, índices y ratings ESG.</w:t>
       </w:r>
@@ -1256,9 +1075,9 @@
           <w:color w:val="479589"/>
           <w:sz w:val="36"/>
           <w:szCs w:val="36"/>
-          <w:rFonts w:ascii="Calibri Light" w:cs="Calibri Light" w:eastAsia="Calibri Light" w:hAnsi="Calibri Light"/>
-        </w:rPr>
-        <w:t xml:space="preserve">BENEFICIOS PARA LA COMPAÑÍA</w:t>
+        </w:rPr>
+        <w:lastRenderedPageBreak/>
+        <w:t>BENEFICIOS PARA LA COMPAÑÍA</w:t>
       </w:r>
     </w:p>
     <w:p>
@@ -1271,9 +1090,6 @@
           <w:b/>
           <w:bCs/>
           <w:color w:val="C73E3A"/>
-          <w:sz w:val="22"/>
-          <w:szCs w:val="22"/>
-          <w:rFonts w:ascii="Calibri Light" w:cs="Calibri Light" w:eastAsia="Calibri Light" w:hAnsi="Calibri Light"/>
         </w:rPr>
         <w:t xml:space="preserve">• </w:t>
       </w:r>
@@ -1281,19 +1097,13 @@
         <w:rPr>
           <w:b/>
           <w:bCs/>
-          <w:color w:val="1a1a1a"/>
-          <w:sz w:val="22"/>
-          <w:szCs w:val="22"/>
-          <w:rFonts w:ascii="Calibri Light" w:cs="Calibri Light" w:eastAsia="Calibri Light" w:hAnsi="Calibri Light"/>
-        </w:rPr>
-        <w:t xml:space="preserve">Inclusión de talento diverso</w:t>
-      </w:r>
-      <w:r>
-        <w:rPr>
-          <w:color w:val="1a1a1a"/>
-          <w:sz w:val="22"/>
-          <w:szCs w:val="22"/>
-          <w:rFonts w:ascii="Calibri Light" w:cs="Calibri Light" w:eastAsia="Calibri Light" w:hAnsi="Calibri Light"/>
+          <w:color w:val="1A1A1A"/>
+        </w:rPr>
+        <w:t>Inclusión de talento diverso</w:t>
+      </w:r>
+      <w:r>
+        <w:rPr>
+          <w:color w:val="1A1A1A"/>
         </w:rPr>
         <w:t xml:space="preserve"> y potenciación de una cultura inclusiva dentro de la organización.</w:t>
       </w:r>
@@ -1308,9 +1118,6 @@
           <w:b/>
           <w:bCs/>
           <w:color w:val="C73E3A"/>
-          <w:sz w:val="22"/>
-          <w:szCs w:val="22"/>
-          <w:rFonts w:ascii="Calibri Light" w:cs="Calibri Light" w:eastAsia="Calibri Light" w:hAnsi="Calibri Light"/>
         </w:rPr>
         <w:t xml:space="preserve">• </w:t>
       </w:r>
@@ -1318,19 +1125,13 @@
         <w:rPr>
           <w:b/>
           <w:bCs/>
-          <w:color w:val="1a1a1a"/>
-          <w:sz w:val="22"/>
-          <w:szCs w:val="22"/>
-          <w:rFonts w:ascii="Calibri Light" w:cs="Calibri Light" w:eastAsia="Calibri Light" w:hAnsi="Calibri Light"/>
-        </w:rPr>
-        <w:t xml:space="preserve">Posicionamiento</w:t>
-      </w:r>
-      <w:r>
-        <w:rPr>
-          <w:color w:val="1a1a1a"/>
-          <w:sz w:val="22"/>
-          <w:szCs w:val="22"/>
-          <w:rFonts w:ascii="Calibri Light" w:cs="Calibri Light" w:eastAsia="Calibri Light" w:hAnsi="Calibri Light"/>
+          <w:color w:val="1A1A1A"/>
+        </w:rPr>
+        <w:t>Posicionamiento</w:t>
+      </w:r>
+      <w:r>
+        <w:rPr>
+          <w:color w:val="1A1A1A"/>
         </w:rPr>
         <w:t xml:space="preserve"> como referente en la integración laboral de personas vulnerables.</w:t>
       </w:r>
@@ -1345,9 +1146,6 @@
           <w:b/>
           <w:bCs/>
           <w:color w:val="C73E3A"/>
-          <w:sz w:val="22"/>
-          <w:szCs w:val="22"/>
-          <w:rFonts w:ascii="Calibri Light" w:cs="Calibri Light" w:eastAsia="Calibri Light" w:hAnsi="Calibri Light"/>
         </w:rPr>
         <w:t xml:space="preserve">• </w:t>
       </w:r>
@@ -1355,19 +1153,13 @@
         <w:rPr>
           <w:b/>
           <w:bCs/>
-          <w:color w:val="1a1a1a"/>
-          <w:sz w:val="22"/>
-          <w:szCs w:val="22"/>
-          <w:rFonts w:ascii="Calibri Light" w:cs="Calibri Light" w:eastAsia="Calibri Light" w:hAnsi="Calibri Light"/>
-        </w:rPr>
-        <w:t xml:space="preserve">Empleados comprometidos</w:t>
-      </w:r>
-      <w:r>
-        <w:rPr>
-          <w:color w:val="1a1a1a"/>
-          <w:sz w:val="22"/>
-          <w:szCs w:val="22"/>
-          <w:rFonts w:ascii="Calibri Light" w:cs="Calibri Light" w:eastAsia="Calibri Light" w:hAnsi="Calibri Light"/>
+          <w:color w:val="1A1A1A"/>
+        </w:rPr>
+        <w:t>Empleados comprometidos</w:t>
+      </w:r>
+      <w:r>
+        <w:rPr>
+          <w:color w:val="1A1A1A"/>
         </w:rPr>
         <w:t xml:space="preserve"> con la estrategia empresarial de DE&amp;I y orgullo de pertenencia.</w:t>
       </w:r>
@@ -1382,9 +1174,6 @@
           <w:b/>
           <w:bCs/>
           <w:color w:val="C73E3A"/>
-          <w:sz w:val="22"/>
-          <w:szCs w:val="22"/>
-          <w:rFonts w:ascii="Calibri Light" w:cs="Calibri Light" w:eastAsia="Calibri Light" w:hAnsi="Calibri Light"/>
         </w:rPr>
         <w:t xml:space="preserve">• </w:t>
       </w:r>
@@ -1392,19 +1181,13 @@
         <w:rPr>
           <w:b/>
           <w:bCs/>
-          <w:color w:val="1a1a1a"/>
-          <w:sz w:val="22"/>
-          <w:szCs w:val="22"/>
-          <w:rFonts w:ascii="Calibri Light" w:cs="Calibri Light" w:eastAsia="Calibri Light" w:hAnsi="Calibri Light"/>
-        </w:rPr>
-        <w:t xml:space="preserve">Sensibilización y concienciación</w:t>
-      </w:r>
-      <w:r>
-        <w:rPr>
-          <w:color w:val="1a1a1a"/>
-          <w:sz w:val="22"/>
-          <w:szCs w:val="22"/>
-          <w:rFonts w:ascii="Calibri Light" w:cs="Calibri Light" w:eastAsia="Calibri Light" w:hAnsi="Calibri Light"/>
+          <w:color w:val="1A1A1A"/>
+        </w:rPr>
+        <w:t>Sensibilización y concienciación</w:t>
+      </w:r>
+      <w:r>
+        <w:rPr>
+          <w:color w:val="1A1A1A"/>
         </w:rPr>
         <w:t xml:space="preserve"> sobre el valor de la diversidad e igualdad de oportunidades.</w:t>
       </w:r>
@@ -1419,9 +1202,6 @@
           <w:b/>
           <w:bCs/>
           <w:color w:val="C73E3A"/>
-          <w:sz w:val="22"/>
-          <w:szCs w:val="22"/>
-          <w:rFonts w:ascii="Calibri Light" w:cs="Calibri Light" w:eastAsia="Calibri Light" w:hAnsi="Calibri Light"/>
         </w:rPr>
         <w:t xml:space="preserve">• </w:t>
       </w:r>
@@ -1429,19 +1209,13 @@
         <w:rPr>
           <w:b/>
           <w:bCs/>
-          <w:color w:val="1a1a1a"/>
-          <w:sz w:val="22"/>
-          <w:szCs w:val="22"/>
-          <w:rFonts w:ascii="Calibri Light" w:cs="Calibri Light" w:eastAsia="Calibri Light" w:hAnsi="Calibri Light"/>
-        </w:rPr>
-        <w:t xml:space="preserve">Extensión de la huella social</w:t>
-      </w:r>
-      <w:r>
-        <w:rPr>
-          <w:color w:val="1a1a1a"/>
-          <w:sz w:val="22"/>
-          <w:szCs w:val="22"/>
-          <w:rFonts w:ascii="Calibri Light" w:cs="Calibri Light" w:eastAsia="Calibri Light" w:hAnsi="Calibri Light"/>
+          <w:color w:val="1A1A1A"/>
+        </w:rPr>
+        <w:t>Extensión de la huella social</w:t>
+      </w:r>
+      <w:r>
+        <w:rPr>
+          <w:color w:val="1A1A1A"/>
         </w:rPr>
         <w:t xml:space="preserve"> a clientes, proveedores y otros grupos de interés.</w:t>
       </w:r>
@@ -1456,9 +1230,6 @@
           <w:b/>
           <w:bCs/>
           <w:color w:val="C73E3A"/>
-          <w:sz w:val="22"/>
-          <w:szCs w:val="22"/>
-          <w:rFonts w:ascii="Calibri Light" w:cs="Calibri Light" w:eastAsia="Calibri Light" w:hAnsi="Calibri Light"/>
         </w:rPr>
         <w:t xml:space="preserve">• </w:t>
       </w:r>
@@ -1466,19 +1237,13 @@
         <w:rPr>
           <w:b/>
           <w:bCs/>
-          <w:color w:val="1a1a1a"/>
-          <w:sz w:val="22"/>
-          <w:szCs w:val="22"/>
-          <w:rFonts w:ascii="Calibri Light" w:cs="Calibri Light" w:eastAsia="Calibri Light" w:hAnsi="Calibri Light"/>
-        </w:rPr>
-        <w:t xml:space="preserve">Retorno económico</w:t>
-      </w:r>
-      <w:r>
-        <w:rPr>
-          <w:color w:val="1a1a1a"/>
-          <w:sz w:val="22"/>
-          <w:szCs w:val="22"/>
-          <w:rFonts w:ascii="Calibri Light" w:cs="Calibri Light" w:eastAsia="Calibri Light" w:hAnsi="Calibri Light"/>
+          <w:color w:val="1A1A1A"/>
+        </w:rPr>
+        <w:t>Retorno económico</w:t>
+      </w:r>
+      <w:r>
+        <w:rPr>
+          <w:color w:val="1A1A1A"/>
         </w:rPr>
         <w:t xml:space="preserve"> por bonificaciones de la Seguridad Social e incentivos a la contratación inclusiva.</w:t>
       </w:r>
@@ -1493,9 +1258,6 @@
           <w:b/>
           <w:bCs/>
           <w:color w:val="C73E3A"/>
-          <w:sz w:val="22"/>
-          <w:szCs w:val="22"/>
-          <w:rFonts w:ascii="Calibri Light" w:cs="Calibri Light" w:eastAsia="Calibri Light" w:hAnsi="Calibri Light"/>
         </w:rPr>
         <w:t xml:space="preserve">• </w:t>
       </w:r>
@@ -1503,19 +1265,13 @@
         <w:rPr>
           <w:b/>
           <w:bCs/>
-          <w:color w:val="1a1a1a"/>
-          <w:sz w:val="22"/>
-          <w:szCs w:val="22"/>
-          <w:rFonts w:ascii="Calibri Light" w:cs="Calibri Light" w:eastAsia="Calibri Light" w:hAnsi="Calibri Light"/>
-        </w:rPr>
-        <w:t xml:space="preserve">Refuerzo de la imagen de marca</w:t>
-      </w:r>
-      <w:r>
-        <w:rPr>
-          <w:color w:val="1a1a1a"/>
-          <w:sz w:val="22"/>
-          <w:szCs w:val="22"/>
-          <w:rFonts w:ascii="Calibri Light" w:cs="Calibri Light" w:eastAsia="Calibri Light" w:hAnsi="Calibri Light"/>
+          <w:color w:val="1A1A1A"/>
+        </w:rPr>
+        <w:t>Refuerzo de la imagen de marca</w:t>
+      </w:r>
+      <w:r>
+        <w:rPr>
+          <w:color w:val="1A1A1A"/>
         </w:rPr>
         <w:t xml:space="preserve"> y visibilización de la dimensión social del ESG.</w:t>
       </w:r>
@@ -1530,9 +1286,6 @@
           <w:b/>
           <w:bCs/>
           <w:color w:val="C73E3A"/>
-          <w:sz w:val="22"/>
-          <w:szCs w:val="22"/>
-          <w:rFonts w:ascii="Calibri Light" w:cs="Calibri Light" w:eastAsia="Calibri Light" w:hAnsi="Calibri Light"/>
         </w:rPr>
         <w:t xml:space="preserve">• </w:t>
       </w:r>
@@ -1540,19 +1293,13 @@
         <w:rPr>
           <w:b/>
           <w:bCs/>
-          <w:color w:val="1a1a1a"/>
-          <w:sz w:val="22"/>
-          <w:szCs w:val="22"/>
-          <w:rFonts w:ascii="Calibri Light" w:cs="Calibri Light" w:eastAsia="Calibri Light" w:hAnsi="Calibri Light"/>
-        </w:rPr>
-        <w:t xml:space="preserve">Cumplimiento</w:t>
-      </w:r>
-      <w:r>
-        <w:rPr>
-          <w:color w:val="1a1a1a"/>
-          <w:sz w:val="22"/>
-          <w:szCs w:val="22"/>
-          <w:rFonts w:ascii="Calibri Light" w:cs="Calibri Light" w:eastAsia="Calibri Light" w:hAnsi="Calibri Light"/>
+          <w:color w:val="1A1A1A"/>
+        </w:rPr>
+        <w:t>Cumplimiento</w:t>
+      </w:r>
+      <w:r>
+        <w:rPr>
+          <w:color w:val="1A1A1A"/>
         </w:rPr>
         <w:t xml:space="preserve"> de la normativa vigente (LGD, CSRD).</w:t>
       </w:r>
@@ -1561,13 +1308,6 @@
       <w:pPr>
         <w:spacing w:after="240"/>
       </w:pPr>
-      <w:r>
-        <w:rPr>
-          <w:sz w:val="16"/>
-          <w:szCs w:val="16"/>
-          <w:rFonts w:ascii="Calibri Light" w:cs="Calibri Light" w:eastAsia="Calibri Light" w:hAnsi="Calibri Light"/>
-        </w:rPr>
-      </w:r>
     </w:p>
     <w:p>
       <w:pPr>
@@ -1576,10 +1316,7 @@
       </w:pPr>
       <w:r>
         <w:rPr>
-          <w:color w:val="1a1a1a"/>
-          <w:sz w:val="22"/>
-          <w:szCs w:val="22"/>
-          <w:rFonts w:ascii="Calibri Light" w:cs="Calibri Light" w:eastAsia="Calibri Light" w:hAnsi="Calibri Light"/>
+          <w:color w:val="1A1A1A"/>
         </w:rPr>
         <w:t xml:space="preserve">Anualmente, facilitamos un </w:t>
       </w:r>
@@ -1590,18 +1327,12 @@
           <w:i/>
           <w:iCs/>
           <w:color w:val="C73E3A"/>
-          <w:sz w:val="22"/>
-          <w:szCs w:val="22"/>
-          <w:rFonts w:ascii="Calibri Light" w:cs="Calibri Light" w:eastAsia="Calibri Light" w:hAnsi="Calibri Light"/>
-        </w:rPr>
-        <w:t xml:space="preserve">"Informe de huella social"</w:t>
-      </w:r>
-      <w:r>
-        <w:rPr>
-          <w:color w:val="1a1a1a"/>
-          <w:sz w:val="22"/>
-          <w:szCs w:val="22"/>
-          <w:rFonts w:ascii="Calibri Light" w:cs="Calibri Light" w:eastAsia="Calibri Light" w:hAnsi="Calibri Light"/>
+        </w:rPr>
+        <w:t>"Informe de huella social"</w:t>
+      </w:r>
+      <w:r>
+        <w:rPr>
+          <w:color w:val="1A1A1A"/>
         </w:rPr>
         <w:t xml:space="preserve"> con el resumen de todas las acciones realizadas y el impacto generado, así como la información requerida para los </w:t>
       </w:r>
@@ -1609,27 +1340,21 @@
         <w:rPr>
           <w:b/>
           <w:bCs/>
-          <w:color w:val="1a1a1a"/>
-          <w:sz w:val="22"/>
-          <w:szCs w:val="22"/>
-          <w:rFonts w:ascii="Calibri Light" w:cs="Calibri Light" w:eastAsia="Calibri Light" w:hAnsi="Calibri Light"/>
-        </w:rPr>
-        <w:t xml:space="preserve">EINF (Estados de información no financiera)</w:t>
-      </w:r>
-      <w:r>
-        <w:rPr>
-          <w:color w:val="1a1a1a"/>
-          <w:sz w:val="22"/>
-          <w:szCs w:val="22"/>
-          <w:rFonts w:ascii="Calibri Light" w:cs="Calibri Light" w:eastAsia="Calibri Light" w:hAnsi="Calibri Light"/>
-        </w:rPr>
-        <w:t xml:space="preserve">.</w:t>
+          <w:color w:val="1A1A1A"/>
+        </w:rPr>
+        <w:t>EINF (Estados de información no financiera)</w:t>
+      </w:r>
+      <w:r>
+        <w:rPr>
+          <w:color w:val="1A1A1A"/>
+        </w:rPr>
+        <w:t>.</w:t>
       </w:r>
     </w:p>
     <w:p>
       <w:pPr>
         <w:pBdr>
-          <w:bottom w:val="single" w:color="479589" w:sz="8" w:space="4"/>
+          <w:bottom w:val="single" w:sz="8" w:space="4" w:color="479589"/>
         </w:pBdr>
         <w:spacing w:before="200" w:after="120"/>
       </w:pPr>
@@ -1640,9 +1365,8 @@
           <w:color w:val="479589"/>
           <w:sz w:val="24"/>
           <w:szCs w:val="24"/>
-          <w:rFonts w:ascii="Calibri Light" w:cs="Calibri Light" w:eastAsia="Calibri Light" w:hAnsi="Calibri Light"/>
-        </w:rPr>
-        <w:t xml:space="preserve">PRESUPUESTO ECONÓMICO</w:t>
+        </w:rPr>
+        <w:t>PRESUPUESTO ECONÓMICO</w:t>
       </w:r>
     </w:p>
     <w:p>
@@ -1652,12 +1376,9 @@
       </w:pPr>
       <w:r>
         <w:rPr>
-          <w:color w:val="1a1a1a"/>
-          <w:sz w:val="22"/>
-          <w:szCs w:val="22"/>
-          <w:rFonts w:ascii="Calibri Light" w:cs="Calibri Light" w:eastAsia="Calibri Light" w:hAnsi="Calibri Light"/>
-        </w:rPr>
-        <w:t xml:space="preserve">La financiación de este proyecto supone una inversión sostenible que contribuye a transformar la vida de las personas, generando además un impacto positivo en la compañía, los empleados y la sociedad.</w:t>
+          <w:color w:val="1A1A1A"/>
+        </w:rPr>
+        <w:t>La financiación de este proyecto supone una inversión sostenible que contribuye a transformar la vida de las personas, generando además un impacto positivo en la compañía, los empleados y la sociedad.</w:t>
       </w:r>
     </w:p>
     <w:p>
@@ -1668,10 +1389,9 @@
         <w:rPr>
           <w:b/>
           <w:bCs/>
-          <w:color w:val="1a1a1a"/>
+          <w:color w:val="1A1A1A"/>
           <w:sz w:val="24"/>
           <w:szCs w:val="24"/>
-          <w:rFonts w:ascii="Calibri Light" w:cs="Calibri Light" w:eastAsia="Calibri Light" w:hAnsi="Calibri Light"/>
         </w:rPr>
         <w:t xml:space="preserve">Donación: </w:t>
       </w:r>
@@ -1682,16 +1402,12 @@
           <w:color w:val="479589"/>
           <w:sz w:val="24"/>
           <w:szCs w:val="24"/>
-          <w:rFonts w:ascii="Calibri Light" w:cs="Calibri Light" w:eastAsia="Calibri Light" w:hAnsi="Calibri Light"/>
-        </w:rPr>
-        <w:t xml:space="preserve">{{IMPORTE_CUERPO}}</w:t>
-      </w:r>
-      <w:r>
-        <w:rPr>
-          <w:color w:val="6b7280"/>
-          <w:sz w:val="22"/>
-          <w:szCs w:val="22"/>
-          <w:rFonts w:ascii="Calibri Light" w:cs="Calibri Light" w:eastAsia="Calibri Light" w:hAnsi="Calibri Light"/>
+        </w:rPr>
+        <w:t>{{IMPORTE_CUERPO}}</w:t>
+      </w:r>
+      <w:r>
+        <w:rPr>
+          <w:color w:val="6B7280"/>
         </w:rPr>
         <w:t xml:space="preserve">    ·    vía {{VIA_CUERPO}}</w:t>
       </w:r>
@@ -1704,21 +1420,15 @@
         <w:rPr>
           <w:b/>
           <w:bCs/>
-          <w:color w:val="1a1a1a"/>
-          <w:sz w:val="22"/>
-          <w:szCs w:val="22"/>
-          <w:rFonts w:ascii="Calibri Light" w:cs="Calibri Light" w:eastAsia="Calibri Light" w:hAnsi="Calibri Light"/>
+          <w:color w:val="1A1A1A"/>
         </w:rPr>
         <w:t xml:space="preserve">Duración del convenio: </w:t>
       </w:r>
       <w:r>
         <w:rPr>
-          <w:color w:val="1a1a1a"/>
-          <w:sz w:val="22"/>
-          <w:szCs w:val="22"/>
-          <w:rFonts w:ascii="Calibri Light" w:cs="Calibri Light" w:eastAsia="Calibri Light" w:hAnsi="Calibri Light"/>
-        </w:rPr>
-        <w:t xml:space="preserve">1 año, renovable</w:t>
+          <w:color w:val="1A1A1A"/>
+        </w:rPr>
+        <w:t>1 año, renovable</w:t>
       </w:r>
     </w:p>
     <w:p>
@@ -1729,21 +1439,15 @@
         <w:rPr>
           <w:b/>
           <w:bCs/>
-          <w:color w:val="1a1a1a"/>
-          <w:sz w:val="22"/>
-          <w:szCs w:val="22"/>
-          <w:rFonts w:ascii="Calibri Light" w:cs="Calibri Light" w:eastAsia="Calibri Light" w:hAnsi="Calibri Light"/>
+          <w:color w:val="1A1A1A"/>
         </w:rPr>
         <w:t xml:space="preserve">Ámbito de actuación: </w:t>
       </w:r>
       <w:r>
         <w:rPr>
-          <w:color w:val="1a1a1a"/>
-          <w:sz w:val="22"/>
-          <w:szCs w:val="22"/>
-          <w:rFonts w:ascii="Calibri Light" w:cs="Calibri Light" w:eastAsia="Calibri Light" w:hAnsi="Calibri Light"/>
-        </w:rPr>
-        <w:t xml:space="preserve">Madrid, Barcelona, Zaragoza, Valencia, Andalucía (Sevilla, Málaga y Cádiz), Canarias y Baleares.</w:t>
+          <w:color w:val="1A1A1A"/>
+        </w:rPr>
+        <w:t>Madrid, Barcelona, Zaragoza, Valencia, Andalucía (Sevilla, Málaga y Cádiz), Canarias y Baleares.</w:t>
       </w:r>
     </w:p>
     <w:p>
@@ -1754,12 +1458,11 @@
         <w:rPr>
           <w:i/>
           <w:iCs/>
-          <w:color w:val="6b7280"/>
+          <w:color w:val="6B7280"/>
           <w:sz w:val="16"/>
           <w:szCs w:val="16"/>
-          <w:rFonts w:ascii="Calibri Light" w:cs="Calibri Light" w:eastAsia="Calibri Light" w:hAnsi="Calibri Light"/>
-        </w:rPr>
-        <w:t xml:space="preserve">(*) Aplicable deducción del Impuesto de Sociedades (40%). Bonificaciones por contratación de personas con discapacidad, mujeres víctimas de violencia y personas en exclusión social. Ahorro en la LGD a través de la contratación directa de PcD.</w:t>
+        </w:rPr>
+        <w:t>(*) Aplicable deducción del Impuesto de Sociedades (40%). Bonificaciones por contratación de personas con discapacidad, mujeres víctimas de violencia y personas en exclusión social. Ahorro en la LGD a través de la contratación directa de PcD.</w:t>
       </w:r>
     </w:p>
     <w:p>
@@ -1768,11 +1471,14 @@
         <w:jc w:val="center"/>
       </w:pPr>
       <w:r>
+        <w:rPr>
+          <w:noProof/>
+        </w:rPr>
         <w:drawing>
-          <wp:inline distT="0" distB="0" distL="0" distR="0">
+          <wp:inline distT="0" distB="0" distL="0" distR="0" wp14:anchorId="2241C32C" wp14:editId="4FE92C20">
             <wp:extent cx="1524000" cy="857250"/>
-            <wp:effectExtent t="0" r="0" b="0" l="0"/>
-            <wp:docPr id="1" name="" descr="" title=""/>
+            <wp:effectExtent l="0" t="0" r="0" b="0"/>
+            <wp:docPr id="1144865397" name="Imagen 1144865397"/>
             <wp:cNvGraphicFramePr>
               <a:graphicFrameLocks xmlns:a="http://schemas.openxmlformats.org/drawingml/2006/main" noChangeAspect="1"/>
             </wp:cNvGraphicFramePr>
@@ -1780,13 +1486,13 @@
               <a:graphicData uri="http://schemas.openxmlformats.org/drawingml/2006/picture">
                 <pic:pic xmlns:pic="http://schemas.openxmlformats.org/drawingml/2006/picture">
                   <pic:nvPicPr>
-                    <pic:cNvPr id="0" name="" descr=""/>
+                    <pic:cNvPr id="0" name=""/>
                     <pic:cNvPicPr>
                       <a:picLocks noChangeAspect="1" noChangeArrowheads="1"/>
                     </pic:cNvPicPr>
                   </pic:nvPicPr>
                   <pic:blipFill>
-                    <a:blip r:embed="rId10" cstate="none"/>
+                    <a:blip r:embed="rId10"/>
                     <a:srcRect/>
                     <a:stretch>
                       <a:fillRect/>
@@ -1809,33 +1515,39 @@
       </w:r>
     </w:p>
     <w:sectPr>
-      <w:headerReference w:type="default" r:id="rId6"/>
-      <w:pgSz w:w="11906" w:h="16838" w:orient="portrait"/>
+      <w:headerReference w:type="default" r:id="rId11"/>
+      <w:pgSz w:w="11906" w:h="16838"/>
       <w:pgMar w:top="1440" w:right="1133" w:bottom="993" w:left="1080" w:header="709" w:footer="709" w:gutter="0"/>
-      <w:pgNumType/>
+      <w:cols w:space="720"/>
       <w:docGrid w:linePitch="360"/>
     </w:sectPr>
   </w:body>
 </w:document>
 </file>
 
-<file path=word/comments.xml><?xml version="1.0" encoding="utf-8"?>
-<w:comments xmlns:cx="http://schemas.microsoft.com/office/drawing/2014/chartex" xmlns:cx1="http://schemas.microsoft.com/office/drawing/2015/9/8/chartex" xmlns:cx2="http://schemas.microsoft.com/office/drawing/2015/10/21/chartex" xmlns:cx3="http://schemas.microsoft.com/office/drawing/2016/5/9/chartex" xmlns:cx4="http://schemas.microsoft.com/office/drawing/2016/5/10/chartex" xmlns:cx5="http://schemas.microsoft.com/office/drawing/2016/5/11/chartex" xmlns:cx6="http://schemas.microsoft.com/office/drawing/2016/5/12/chartex" xmlns:cx7="http://schemas.microsoft.com/office/drawing/2016/5/13/chartex" xmlns:cx8="http://schemas.microsoft.com/office/drawing/2016/5/14/chartex" xmlns:mc="http://schemas.openxmlformats.org/markup-compatibility/2006" xmlns:aink="http://schemas.microsoft.com/office/drawing/2016/ink" xmlns:am3d="http://schemas.microsoft.com/office/drawing/2017/model3d" xmlns:o="urn:schemas-microsoft-com:office:office" xmlns:r="http://schemas.openxmlformats.org/officeDocument/2006/relationships" xmlns:m="http://schemas.openxmlformats.org/officeDocument/2006/math" xmlns:v="urn:schemas-microsoft-com:vml" xmlns:wp14="http://schemas.microsoft.com/office/word/2010/wordprocessingDrawing" xmlns:wp="http://schemas.openxmlformats.org/drawingml/2006/wordprocessingDrawing" xmlns:w10="urn:schemas-microsoft-com:office:word" xmlns:w="http://schemas.openxmlformats.org/wordprocessingml/2006/main" xmlns:w14="http://schemas.microsoft.com/office/word/2010/wordml" xmlns:w15="http://schemas.microsoft.com/office/word/2012/wordml" xmlns:w16cex="http://schemas.microsoft.com/office/word/2018/wordml/cex" xmlns:w16cid="http://schemas.microsoft.com/office/word/2016/wordml/cid" xmlns:w16="http://schemas.microsoft.com/office/word/2018/wordml" xmlns:w16sdtdh="http://schemas.microsoft.com/office/word/2020/wordml/sdtdatahash" xmlns:w16se="http://schemas.microsoft.com/office/word/2015/wordml/symex" xmlns:wpg="http://schemas.microsoft.com/office/word/2010/wordprocessingGroup" xmlns:wpi="http://schemas.microsoft.com/office/word/2010/wordprocessingInk" xmlns:wne="http://schemas.microsoft.com/office/word/2006/wordml" xmlns:wps="http://schemas.microsoft.com/office/word/2010/wordprocessingShape"/>
+<file path=word/endnotes.xml><?xml version="1.0" encoding="utf-8"?>
+<w:endnotes xmlns:wpc="http://schemas.microsoft.com/office/word/2010/wordprocessingCanvas" xmlns:cx="http://schemas.microsoft.com/office/drawing/2014/chartex" xmlns:cx1="http://schemas.microsoft.com/office/drawing/2015/9/8/chartex" xmlns:cx2="http://schemas.microsoft.com/office/drawing/2015/10/21/chartex" xmlns:cx3="http://schemas.microsoft.com/office/drawing/2016/5/9/chartex" xmlns:cx4="http://schemas.microsoft.com/office/drawing/2016/5/10/chartex" xmlns:cx5="http://schemas.microsoft.com/office/drawing/2016/5/11/chartex" xmlns:cx6="http://schemas.microsoft.com/office/drawing/2016/5/12/chartex" xmlns:cx7="http://schemas.microsoft.com/office/drawing/2016/5/13/chartex" xmlns:cx8="http://schemas.microsoft.com/office/drawing/2016/5/14/chartex" xmlns:mc="http://schemas.openxmlformats.org/markup-compatibility/2006" xmlns:aink="http://schemas.microsoft.com/office/drawing/2016/ink" xmlns:am3d="http://schemas.microsoft.com/office/drawing/2017/model3d" xmlns:o="urn:schemas-microsoft-com:office:office" xmlns:oel="http://schemas.microsoft.com/office/2019/extlst" xmlns:r="http://schemas.openxmlformats.org/officeDocument/2006/relationships" xmlns:m="http://schemas.openxmlformats.org/officeDocument/2006/math" xmlns:v="urn:schemas-microsoft-com:vml" xmlns:wp14="http://schemas.microsoft.com/office/word/2010/wordprocessingDrawing" xmlns:wp="http://schemas.openxmlformats.org/drawingml/2006/wordprocessingDrawing" xmlns:w10="urn:schemas-microsoft-com:office:word" xmlns:w="http://schemas.openxmlformats.org/wordprocessingml/2006/main" xmlns:w14="http://schemas.microsoft.com/office/word/2010/wordml" xmlns:w15="http://schemas.microsoft.com/office/word/2012/wordml" xmlns:w16cex="http://schemas.microsoft.com/office/word/2018/wordml/cex" xmlns:w16cid="http://schemas.microsoft.com/office/word/2016/wordml/cid" xmlns:w16="http://schemas.microsoft.com/office/word/2018/wordml" xmlns:w16du="http://schemas.microsoft.com/office/word/2023/wordml/word16du" xmlns:w16sdtdh="http://schemas.microsoft.com/office/word/2020/wordml/sdtdatahash" xmlns:w16sdtfl="http://schemas.microsoft.com/office/word/2024/wordml/sdtformatlock" xmlns:w16se="http://schemas.microsoft.com/office/word/2015/wordml/symex" xmlns:wpg="http://schemas.microsoft.com/office/word/2010/wordprocessingGroup" xmlns:wpi="http://schemas.microsoft.com/office/word/2010/wordprocessingInk" xmlns:wne="http://schemas.microsoft.com/office/word/2006/wordml" xmlns:wps="http://schemas.microsoft.com/office/word/2010/wordprocessingShape" mc:Ignorable="w14 w15 w16se w16cid w16 w16cex w16sdtdh w16sdtfl w16du wp14">
+  <w:endnote w:type="separator" w:id="-1">
+    <w:p>
+      <w:r>
+        <w:separator/>
+      </w:r>
+    </w:p>
+  </w:endnote>
+  <w:endnote w:type="continuationSeparator" w:id="0">
+    <w:p>
+      <w:r>
+        <w:continuationSeparator/>
+      </w:r>
+    </w:p>
+  </w:endnote>
+</w:endnotes>
 </file>
 
 <file path=word/footnotes.xml><?xml version="1.0" encoding="utf-8"?>
-<w:footnotes xmlns:wpc="http://schemas.microsoft.com/office/word/2010/wordprocessingCanvas" xmlns:mc="http://schemas.openxmlformats.org/markup-compatibility/2006" xmlns:o="urn:schemas-microsoft-com:office:office" xmlns:r="http://schemas.openxmlformats.org/officeDocument/2006/relationships" xmlns:m="http://schemas.openxmlformats.org/officeDocument/2006/math" xmlns:v="urn:schemas-microsoft-com:vml" xmlns:wp14="http://schemas.microsoft.com/office/word/2010/wordprocessingDrawing" xmlns:wp="http://schemas.openxmlformats.org/drawingml/2006/wordprocessingDrawing" xmlns:w10="urn:schemas-microsoft-com:office:word" xmlns:w="http://schemas.openxmlformats.org/wordprocessingml/2006/main" xmlns:w14="http://schemas.microsoft.com/office/word/2010/wordml" xmlns:w15="http://schemas.microsoft.com/office/word/2012/wordml" xmlns:wpg="http://schemas.microsoft.com/office/word/2010/wordprocessingGroup" xmlns:wpi="http://schemas.microsoft.com/office/word/2010/wordprocessingInk" xmlns:wne="http://schemas.microsoft.com/office/word/2006/wordml" xmlns:wps="http://schemas.microsoft.com/office/word/2010/wordprocessingShape" mc:Ignorable="w14 w15 wp14">
+<w:footnotes xmlns:wpc="http://schemas.microsoft.com/office/word/2010/wordprocessingCanvas" xmlns:cx="http://schemas.microsoft.com/office/drawing/2014/chartex" xmlns:cx1="http://schemas.microsoft.com/office/drawing/2015/9/8/chartex" xmlns:cx2="http://schemas.microsoft.com/office/drawing/2015/10/21/chartex" xmlns:cx3="http://schemas.microsoft.com/office/drawing/2016/5/9/chartex" xmlns:cx4="http://schemas.microsoft.com/office/drawing/2016/5/10/chartex" xmlns:cx5="http://schemas.microsoft.com/office/drawing/2016/5/11/chartex" xmlns:cx6="http://schemas.microsoft.com/office/drawing/2016/5/12/chartex" xmlns:cx7="http://schemas.microsoft.com/office/drawing/2016/5/13/chartex" xmlns:cx8="http://schemas.microsoft.com/office/drawing/2016/5/14/chartex" xmlns:mc="http://schemas.openxmlformats.org/markup-compatibility/2006" xmlns:aink="http://schemas.microsoft.com/office/drawing/2016/ink" xmlns:am3d="http://schemas.microsoft.com/office/drawing/2017/model3d" xmlns:o="urn:schemas-microsoft-com:office:office" xmlns:oel="http://schemas.microsoft.com/office/2019/extlst" xmlns:r="http://schemas.openxmlformats.org/officeDocument/2006/relationships" xmlns:m="http://schemas.openxmlformats.org/officeDocument/2006/math" xmlns:v="urn:schemas-microsoft-com:vml" xmlns:wp14="http://schemas.microsoft.com/office/word/2010/wordprocessingDrawing" xmlns:wp="http://schemas.openxmlformats.org/drawingml/2006/wordprocessingDrawing" xmlns:w10="urn:schemas-microsoft-com:office:word" xmlns:w="http://schemas.openxmlformats.org/wordprocessingml/2006/main" xmlns:w14="http://schemas.microsoft.com/office/word/2010/wordml" xmlns:w15="http://schemas.microsoft.com/office/word/2012/wordml" xmlns:w16cex="http://schemas.microsoft.com/office/word/2018/wordml/cex" xmlns:w16cid="http://schemas.microsoft.com/office/word/2016/wordml/cid" xmlns:w16="http://schemas.microsoft.com/office/word/2018/wordml" xmlns:w16du="http://schemas.microsoft.com/office/word/2023/wordml/word16du" xmlns:w16sdtdh="http://schemas.microsoft.com/office/word/2020/wordml/sdtdatahash" xmlns:w16sdtfl="http://schemas.microsoft.com/office/word/2024/wordml/sdtformatlock" xmlns:w16se="http://schemas.microsoft.com/office/word/2015/wordml/symex" xmlns:wpg="http://schemas.microsoft.com/office/word/2010/wordprocessingGroup" xmlns:wpi="http://schemas.microsoft.com/office/word/2010/wordprocessingInk" xmlns:wne="http://schemas.microsoft.com/office/word/2006/wordml" xmlns:wps="http://schemas.microsoft.com/office/word/2010/wordprocessingShape" mc:Ignorable="w14 w15 w16se w16cid w16 w16cex w16sdtdh w16sdtfl w16du wp14">
   <w:footnote w:type="separator" w:id="-1">
     <w:p>
-      <w:pPr>
-        <w:spacing w:after="0" w:line="240" w:lineRule="auto"/>
-      </w:pPr>
-      <w:r>
-        <w:rPr>
-          <w:rStyle w:val="FootnoteReference"/>
-        </w:rPr>
-        <w:footnoteRef/>
-      </w:r>
       <w:r>
         <w:separator/>
       </w:r>
@@ -1843,15 +1555,6 @@
   </w:footnote>
   <w:footnote w:type="continuationSeparator" w:id="0">
     <w:p>
-      <w:pPr>
-        <w:spacing w:after="0" w:line="240" w:lineRule="auto"/>
-      </w:pPr>
-      <w:r>
-        <w:rPr>
-          <w:rStyle w:val="FootnoteReference"/>
-        </w:rPr>
-        <w:footnoteRef/>
-      </w:r>
       <w:r>
         <w:continuationSeparator/>
       </w:r>
@@ -1861,44 +1564,55 @@
 </file>
 
 <file path=word/header1.xml><?xml version="1.0" encoding="utf-8"?>
-<w:hdr xmlns:wpc="http://schemas.microsoft.com/office/word/2010/wordprocessingCanvas" xmlns:mc="http://schemas.openxmlformats.org/markup-compatibility/2006" xmlns:o="urn:schemas-microsoft-com:office:office" xmlns:r="http://schemas.openxmlformats.org/officeDocument/2006/relationships" xmlns:m="http://schemas.openxmlformats.org/officeDocument/2006/math" xmlns:v="urn:schemas-microsoft-com:vml" xmlns:wp14="http://schemas.microsoft.com/office/word/2010/wordprocessingDrawing" xmlns:wp="http://schemas.openxmlformats.org/drawingml/2006/wordprocessingDrawing" xmlns:w10="urn:schemas-microsoft-com:office:word" xmlns:w="http://schemas.openxmlformats.org/wordprocessingml/2006/main" xmlns:w14="http://schemas.microsoft.com/office/word/2010/wordml" xmlns:w15="http://schemas.microsoft.com/office/word/2012/wordml" xmlns:wpg="http://schemas.microsoft.com/office/word/2010/wordprocessingGroup" xmlns:wpi="http://schemas.microsoft.com/office/word/2010/wordprocessingInk" xmlns:wne="http://schemas.microsoft.com/office/word/2006/wordml" xmlns:wps="http://schemas.microsoft.com/office/word/2010/wordprocessingShape" xmlns:cx="http://schemas.microsoft.com/office/drawing/2014/chartex" xmlns:cx1="http://schemas.microsoft.com/office/drawing/2015/9/8/chartex" xmlns:cx2="http://schemas.microsoft.com/office/drawing/2015/10/21/chartex" xmlns:cx3="http://schemas.microsoft.com/office/drawing/2016/5/9/chartex" xmlns:cx4="http://schemas.microsoft.com/office/drawing/2016/5/10/chartex" xmlns:cx5="http://schemas.microsoft.com/office/drawing/2016/5/11/chartex" xmlns:cx6="http://schemas.microsoft.com/office/drawing/2016/5/12/chartex" xmlns:cx7="http://schemas.microsoft.com/office/drawing/2016/5/13/chartex" xmlns:cx8="http://schemas.microsoft.com/office/drawing/2016/5/14/chartex" xmlns:w16cid="http://schemas.microsoft.com/office/word/2016/wordml/cid" xmlns:w16se="http://schemas.microsoft.com/office/word/2015/wordml/symex">
+<w:hdr xmlns:wpc="http://schemas.microsoft.com/office/word/2010/wordprocessingCanvas" xmlns:cx="http://schemas.microsoft.com/office/drawing/2014/chartex" xmlns:cx1="http://schemas.microsoft.com/office/drawing/2015/9/8/chartex" xmlns:cx2="http://schemas.microsoft.com/office/drawing/2015/10/21/chartex" xmlns:cx3="http://schemas.microsoft.com/office/drawing/2016/5/9/chartex" xmlns:cx4="http://schemas.microsoft.com/office/drawing/2016/5/10/chartex" xmlns:cx5="http://schemas.microsoft.com/office/drawing/2016/5/11/chartex" xmlns:cx6="http://schemas.microsoft.com/office/drawing/2016/5/12/chartex" xmlns:cx7="http://schemas.microsoft.com/office/drawing/2016/5/13/chartex" xmlns:cx8="http://schemas.microsoft.com/office/drawing/2016/5/14/chartex" xmlns:mc="http://schemas.openxmlformats.org/markup-compatibility/2006" xmlns:aink="http://schemas.microsoft.com/office/drawing/2016/ink" xmlns:am3d="http://schemas.microsoft.com/office/drawing/2017/model3d" xmlns:o="urn:schemas-microsoft-com:office:office" xmlns:oel="http://schemas.microsoft.com/office/2019/extlst" xmlns:r="http://schemas.openxmlformats.org/officeDocument/2006/relationships" xmlns:m="http://schemas.openxmlformats.org/officeDocument/2006/math" xmlns:v="urn:schemas-microsoft-com:vml" xmlns:wp14="http://schemas.microsoft.com/office/word/2010/wordprocessingDrawing" xmlns:wp="http://schemas.openxmlformats.org/drawingml/2006/wordprocessingDrawing" xmlns:w10="urn:schemas-microsoft-com:office:word" xmlns:w="http://schemas.openxmlformats.org/wordprocessingml/2006/main" xmlns:w14="http://schemas.microsoft.com/office/word/2010/wordml" xmlns:w15="http://schemas.microsoft.com/office/word/2012/wordml" xmlns:w16cex="http://schemas.microsoft.com/office/word/2018/wordml/cex" xmlns:w16cid="http://schemas.microsoft.com/office/word/2016/wordml/cid" xmlns:w16="http://schemas.microsoft.com/office/word/2018/wordml" xmlns:w16du="http://schemas.microsoft.com/office/word/2023/wordml/word16du" xmlns:w16sdtdh="http://schemas.microsoft.com/office/word/2020/wordml/sdtdatahash" xmlns:w16sdtfl="http://schemas.microsoft.com/office/word/2024/wordml/sdtformatlock" xmlns:w16se="http://schemas.microsoft.com/office/word/2015/wordml/symex" xmlns:wpg="http://schemas.microsoft.com/office/word/2010/wordprocessingGroup" xmlns:wpi="http://schemas.microsoft.com/office/word/2010/wordprocessingInk" xmlns:wne="http://schemas.microsoft.com/office/word/2006/wordml" xmlns:wps="http://schemas.microsoft.com/office/word/2010/wordprocessingShape" mc:Ignorable="w14 w15 w16se w16cid w16 w16cex w16sdtdh w16sdtfl w16du wp14">
   <w:tbl>
     <w:tblPr>
-      <w:tblW w:type="dxa" w:w="9360"/>
+      <w:tblW w:w="9360" w:type="dxa"/>
       <w:tblBorders>
-        <w:top w:val="none" w:color="FFFFFF" w:sz="0"/>
-        <w:left w:val="none" w:color="FFFFFF" w:sz="0"/>
-        <w:bottom w:val="none" w:color="FFFFFF" w:sz="0"/>
-        <w:right w:val="none" w:color="FFFFFF" w:sz="0"/>
-        <w:insideH w:val="none" w:color="FFFFFF" w:sz="0"/>
-        <w:insideV w:val="none" w:color="FFFFFF" w:sz="0"/>
+        <w:top w:val="none" w:sz="0" w:space="0" w:color="FFFFFF"/>
+        <w:left w:val="none" w:sz="0" w:space="0" w:color="FFFFFF"/>
+        <w:bottom w:val="none" w:sz="0" w:space="0" w:color="FFFFFF"/>
+        <w:right w:val="none" w:sz="0" w:space="0" w:color="FFFFFF"/>
+        <w:insideH w:val="none" w:sz="0" w:space="0" w:color="FFFFFF"/>
+        <w:insideV w:val="none" w:sz="0" w:space="0" w:color="FFFFFF"/>
       </w:tblBorders>
+      <w:tblCellMar>
+        <w:left w:w="10" w:type="dxa"/>
+        <w:right w:w="10" w:type="dxa"/>
+      </w:tblCellMar>
+      <w:tblLook w:val="04A0" w:firstRow="1" w:lastRow="0" w:firstColumn="1" w:lastColumn="0" w:noHBand="0" w:noVBand="1"/>
     </w:tblPr>
     <w:tblGrid>
       <w:gridCol w:w="4680"/>
       <w:gridCol w:w="4680"/>
     </w:tblGrid>
     <w:tr>
+      <w:tblPrEx>
+        <w:tblCellMar>
+          <w:top w:w="0" w:type="dxa"/>
+          <w:bottom w:w="0" w:type="dxa"/>
+        </w:tblCellMar>
+      </w:tblPrEx>
       <w:tc>
         <w:tcPr>
-          <w:tcW w:type="dxa" w:w="4680"/>
+          <w:tcW w:w="4680" w:type="dxa"/>
           <w:tcBorders>
-            <w:top w:val="none" w:color="FFFFFF" w:sz="0"/>
-            <w:left w:val="none" w:color="FFFFFF" w:sz="0"/>
-            <w:bottom w:val="none" w:color="FFFFFF" w:sz="0"/>
-            <w:right w:val="none" w:color="FFFFFF" w:sz="0"/>
+            <w:top w:val="none" w:sz="0" w:space="0" w:color="FFFFFF"/>
+            <w:left w:val="none" w:sz="0" w:space="0" w:color="FFFFFF"/>
+            <w:bottom w:val="none" w:sz="0" w:space="0" w:color="FFFFFF"/>
+            <w:right w:val="none" w:sz="0" w:space="0" w:color="FFFFFF"/>
           </w:tcBorders>
         </w:tcPr>
         <w:p>
-          <w:pPr>
-            <w:jc w:val="left"/>
-          </w:pPr>
           <w:r>
+            <w:rPr>
+              <w:noProof/>
+            </w:rPr>
             <w:drawing>
-              <wp:inline distT="0" distB="0" distL="0" distR="0">
+              <wp:inline distT="0" distB="0" distL="0" distR="0" wp14:anchorId="359AAF0B" wp14:editId="0A3A0726">
                 <wp:extent cx="857250" cy="428625"/>
-                <wp:effectExtent t="0" r="0" b="0" l="0"/>
-                <wp:docPr id="1" name="" descr="" title=""/>
+                <wp:effectExtent l="0" t="0" r="0" b="0"/>
+                <wp:docPr id="1256113825" name="Imagen 1256113825"/>
                 <wp:cNvGraphicFramePr>
                   <a:graphicFrameLocks xmlns:a="http://schemas.openxmlformats.org/drawingml/2006/main" noChangeAspect="1"/>
                 </wp:cNvGraphicFramePr>
@@ -1906,13 +1620,13 @@
                   <a:graphicData uri="http://schemas.openxmlformats.org/drawingml/2006/picture">
                     <pic:pic xmlns:pic="http://schemas.openxmlformats.org/drawingml/2006/picture">
                       <pic:nvPicPr>
-                        <pic:cNvPr id="0" name="" descr=""/>
+                        <pic:cNvPr id="0" name=""/>
                         <pic:cNvPicPr>
                           <a:picLocks noChangeAspect="1" noChangeArrowheads="1"/>
                         </pic:cNvPicPr>
                       </pic:nvPicPr>
                       <pic:blipFill>
-                        <a:blip r:embed="rId0" cstate="none"/>
+                        <a:blip r:embed="rId1"/>
                         <a:srcRect/>
                         <a:stretch>
                           <a:fillRect/>
@@ -1937,12 +1651,12 @@
       </w:tc>
       <w:tc>
         <w:tcPr>
-          <w:tcW w:type="dxa" w:w="4680"/>
+          <w:tcW w:w="4680" w:type="dxa"/>
           <w:tcBorders>
-            <w:top w:val="none" w:color="FFFFFF" w:sz="0"/>
-            <w:left w:val="none" w:color="FFFFFF" w:sz="0"/>
-            <w:bottom w:val="none" w:color="FFFFFF" w:sz="0"/>
-            <w:right w:val="none" w:color="FFFFFF" w:sz="0"/>
+            <w:top w:val="none" w:sz="0" w:space="0" w:color="FFFFFF"/>
+            <w:left w:val="none" w:sz="0" w:space="0" w:color="FFFFFF"/>
+            <w:bottom w:val="none" w:sz="0" w:space="0" w:color="FFFFFF"/>
+            <w:right w:val="none" w:sz="0" w:space="0" w:color="FFFFFF"/>
           </w:tcBorders>
           <w:vAlign w:val="center"/>
         </w:tcPr>
@@ -1954,12 +1668,9 @@
             <w:rPr>
               <w:i/>
               <w:iCs/>
-              <w:color w:val="6b7280"/>
-              <w:sz w:val="22"/>
-              <w:szCs w:val="22"/>
-              <w:rFonts w:ascii="Calibri Light" w:cs="Calibri Light" w:eastAsia="Calibri Light" w:hAnsi="Calibri Light"/>
+              <w:color w:val="6B7280"/>
             </w:rPr>
-            <w:t xml:space="preserve">{{LOGO}}</w:t>
+            <w:t>{{LOGO}}</w:t>
           </w:r>
         </w:p>
       </w:tc>
@@ -1969,10 +1680,12 @@
 </file>
 
 <file path=word/numbering.xml><?xml version="1.0" encoding="utf-8"?>
-<w:numbering xmlns:wpc="http://schemas.microsoft.com/office/word/2010/wordprocessingCanvas" xmlns:mc="http://schemas.openxmlformats.org/markup-compatibility/2006" xmlns:o="urn:schemas-microsoft-com:office:office" xmlns:r="http://schemas.openxmlformats.org/officeDocument/2006/relationships" xmlns:m="http://schemas.openxmlformats.org/officeDocument/2006/math" xmlns:v="urn:schemas-microsoft-com:vml" xmlns:wp14="http://schemas.microsoft.com/office/word/2010/wordprocessingDrawing" xmlns:wp="http://schemas.openxmlformats.org/drawingml/2006/wordprocessingDrawing" xmlns:w10="urn:schemas-microsoft-com:office:word" xmlns:w="http://schemas.openxmlformats.org/wordprocessingml/2006/main" xmlns:w14="http://schemas.microsoft.com/office/word/2010/wordml" xmlns:w15="http://schemas.microsoft.com/office/word/2012/wordml" xmlns:wpg="http://schemas.microsoft.com/office/word/2010/wordprocessingGroup" xmlns:wpi="http://schemas.microsoft.com/office/word/2010/wordprocessingInk" xmlns:wne="http://schemas.microsoft.com/office/word/2006/wordml" xmlns:wps="http://schemas.microsoft.com/office/word/2010/wordprocessingShape" mc:Ignorable="w14 w15 wp14">
-  <w:abstractNum w:abstractNumId="1" w15:restartNumberingAfterBreak="0">
+<w:numbering xmlns:wpc="http://schemas.microsoft.com/office/word/2010/wordprocessingCanvas" xmlns:cx="http://schemas.microsoft.com/office/drawing/2014/chartex" xmlns:cx1="http://schemas.microsoft.com/office/drawing/2015/9/8/chartex" xmlns:cx2="http://schemas.microsoft.com/office/drawing/2015/10/21/chartex" xmlns:cx3="http://schemas.microsoft.com/office/drawing/2016/5/9/chartex" xmlns:cx4="http://schemas.microsoft.com/office/drawing/2016/5/10/chartex" xmlns:cx5="http://schemas.microsoft.com/office/drawing/2016/5/11/chartex" xmlns:cx6="http://schemas.microsoft.com/office/drawing/2016/5/12/chartex" xmlns:cx7="http://schemas.microsoft.com/office/drawing/2016/5/13/chartex" xmlns:cx8="http://schemas.microsoft.com/office/drawing/2016/5/14/chartex" xmlns:mc="http://schemas.openxmlformats.org/markup-compatibility/2006" xmlns:aink="http://schemas.microsoft.com/office/drawing/2016/ink" xmlns:am3d="http://schemas.microsoft.com/office/drawing/2017/model3d" xmlns:o="urn:schemas-microsoft-com:office:office" xmlns:oel="http://schemas.microsoft.com/office/2019/extlst" xmlns:r="http://schemas.openxmlformats.org/officeDocument/2006/relationships" xmlns:m="http://schemas.openxmlformats.org/officeDocument/2006/math" xmlns:v="urn:schemas-microsoft-com:vml" xmlns:wp14="http://schemas.microsoft.com/office/word/2010/wordprocessingDrawing" xmlns:wp="http://schemas.openxmlformats.org/drawingml/2006/wordprocessingDrawing" xmlns:w10="urn:schemas-microsoft-com:office:word" xmlns:w="http://schemas.openxmlformats.org/wordprocessingml/2006/main" xmlns:w14="http://schemas.microsoft.com/office/word/2010/wordml" xmlns:w15="http://schemas.microsoft.com/office/word/2012/wordml" xmlns:w16cex="http://schemas.microsoft.com/office/word/2018/wordml/cex" xmlns:w16cid="http://schemas.microsoft.com/office/word/2016/wordml/cid" xmlns:w16="http://schemas.microsoft.com/office/word/2018/wordml" xmlns:w16du="http://schemas.microsoft.com/office/word/2023/wordml/word16du" xmlns:w16sdtdh="http://schemas.microsoft.com/office/word/2020/wordml/sdtdatahash" xmlns:w16sdtfl="http://schemas.microsoft.com/office/word/2024/wordml/sdtformatlock" xmlns:w16se="http://schemas.microsoft.com/office/word/2015/wordml/symex" xmlns:wpg="http://schemas.microsoft.com/office/word/2010/wordprocessingGroup" xmlns:wpi="http://schemas.microsoft.com/office/word/2010/wordprocessingInk" xmlns:wne="http://schemas.microsoft.com/office/word/2006/wordml" xmlns:wps="http://schemas.microsoft.com/office/word/2010/wordprocessingShape" mc:Ignorable="w14 w15 w16se w16cid w16 w16cex w16sdtdh w16sdtfl w16du wp14">
+  <w:abstractNum w:abstractNumId="0" w15:restartNumberingAfterBreak="0">
+    <w:nsid w:val="2DE72FDE"/>
     <w:multiLevelType w:val="hybridMultilevel"/>
-    <w:lvl w:ilvl="0" w15:tentative="1">
+    <w:tmpl w:val="51F44FA8"/>
+    <w:lvl w:ilvl="0" w:tplc="51B29616">
       <w:start w:val="1"/>
       <w:numFmt w:val="bullet"/>
       <w:lvlText w:val="●"/>
@@ -1981,7 +1694,7 @@
         <w:ind w:left="720" w:hanging="360"/>
       </w:pPr>
     </w:lvl>
-    <w:lvl w:ilvl="1" w15:tentative="1">
+    <w:lvl w:ilvl="1" w:tplc="3CE6C178">
       <w:start w:val="1"/>
       <w:numFmt w:val="bullet"/>
       <w:lvlText w:val="○"/>
@@ -1990,7 +1703,7 @@
         <w:ind w:left="1440" w:hanging="360"/>
       </w:pPr>
     </w:lvl>
-    <w:lvl w:ilvl="2" w15:tentative="1">
+    <w:lvl w:ilvl="2" w:tplc="A1388D00">
       <w:start w:val="1"/>
       <w:numFmt w:val="bullet"/>
       <w:lvlText w:val="■"/>
@@ -1999,7 +1712,7 @@
         <w:ind w:left="2160" w:hanging="360"/>
       </w:pPr>
     </w:lvl>
-    <w:lvl w:ilvl="3" w15:tentative="1">
+    <w:lvl w:ilvl="3" w:tplc="E474F60C">
       <w:start w:val="1"/>
       <w:numFmt w:val="bullet"/>
       <w:lvlText w:val="●"/>
@@ -2008,7 +1721,7 @@
         <w:ind w:left="2880" w:hanging="360"/>
       </w:pPr>
     </w:lvl>
-    <w:lvl w:ilvl="4" w15:tentative="1">
+    <w:lvl w:ilvl="4" w:tplc="C70A5514">
       <w:start w:val="1"/>
       <w:numFmt w:val="bullet"/>
       <w:lvlText w:val="○"/>
@@ -2017,7 +1730,7 @@
         <w:ind w:left="3600" w:hanging="360"/>
       </w:pPr>
     </w:lvl>
-    <w:lvl w:ilvl="5" w15:tentative="1">
+    <w:lvl w:ilvl="5" w:tplc="5B3220C8">
       <w:start w:val="1"/>
       <w:numFmt w:val="bullet"/>
       <w:lvlText w:val="■"/>
@@ -2026,7 +1739,7 @@
         <w:ind w:left="4320" w:hanging="360"/>
       </w:pPr>
     </w:lvl>
-    <w:lvl w:ilvl="6" w15:tentative="1">
+    <w:lvl w:ilvl="6" w:tplc="2454F5A0">
       <w:start w:val="1"/>
       <w:numFmt w:val="bullet"/>
       <w:lvlText w:val="●"/>
@@ -2035,7 +1748,7 @@
         <w:ind w:left="5040" w:hanging="360"/>
       </w:pPr>
     </w:lvl>
-    <w:lvl w:ilvl="7" w15:tentative="1">
+    <w:lvl w:ilvl="7" w:tplc="B2C23F1A">
       <w:start w:val="1"/>
       <w:numFmt w:val="bullet"/>
       <w:lvlText w:val="●"/>
@@ -2044,7 +1757,7 @@
         <w:ind w:left="5760" w:hanging="360"/>
       </w:pPr>
     </w:lvl>
-    <w:lvl w:ilvl="8" w15:tentative="1">
+    <w:lvl w:ilvl="8" w:tplc="4C62BA4C">
       <w:start w:val="1"/>
       <w:numFmt w:val="bullet"/>
       <w:lvlText w:val="●"/>
@@ -2054,8 +1767,8 @@
       </w:pPr>
     </w:lvl>
   </w:abstractNum>
-  <w:num w:numId="1">
-    <w:abstractNumId w:val="1"/>
+  <w:num w:numId="1" w16cid:durableId="830295714">
+    <w:abstractNumId w:val="0"/>
     <w:lvlOverride w:ilvl="0">
       <w:startOverride w:val="1"/>
     </w:lvlOverride>
@@ -2064,117 +1777,543 @@
 </file>
 
 <file path=word/styles.xml><?xml version="1.0" encoding="utf-8"?>
-<w:styles xmlns:mc="http://schemas.openxmlformats.org/markup-compatibility/2006" xmlns:r="http://schemas.openxmlformats.org/officeDocument/2006/relationships" xmlns:w="http://schemas.openxmlformats.org/wordprocessingml/2006/main" xmlns:w14="http://schemas.microsoft.com/office/word/2010/wordml" xmlns:w15="http://schemas.microsoft.com/office/word/2012/wordml" mc:Ignorable="w14 w15">
+<w:styles xmlns:mc="http://schemas.openxmlformats.org/markup-compatibility/2006" xmlns:r="http://schemas.openxmlformats.org/officeDocument/2006/relationships" xmlns:w="http://schemas.openxmlformats.org/wordprocessingml/2006/main" xmlns:w14="http://schemas.microsoft.com/office/word/2010/wordml" xmlns:w15="http://schemas.microsoft.com/office/word/2012/wordml" xmlns:w16cex="http://schemas.microsoft.com/office/word/2018/wordml/cex" xmlns:w16cid="http://schemas.microsoft.com/office/word/2016/wordml/cid" xmlns:w16="http://schemas.microsoft.com/office/word/2018/wordml" xmlns:w16du="http://schemas.microsoft.com/office/word/2023/wordml/word16du" xmlns:w16sdtdh="http://schemas.microsoft.com/office/word/2020/wordml/sdtdatahash" xmlns:w16sdtfl="http://schemas.microsoft.com/office/word/2024/wordml/sdtformatlock" xmlns:w16se="http://schemas.microsoft.com/office/word/2015/wordml/symex" mc:Ignorable="w14 w15 w16se w16cid w16 w16cex w16sdtdh w16sdtfl w16du">
   <w:docDefaults>
     <w:rPrDefault>
       <w:rPr>
+        <w:rFonts w:ascii="Calibri Light" w:eastAsia="Calibri Light" w:hAnsi="Calibri Light" w:cs="Calibri Light"/>
         <w:sz w:val="22"/>
         <w:szCs w:val="22"/>
-        <w:rFonts w:ascii="Calibri Light" w:cs="Calibri Light" w:eastAsia="Calibri Light" w:hAnsi="Calibri Light"/>
+        <w:lang w:val="es-ES" w:eastAsia="es-ES" w:bidi="ar-SA"/>
       </w:rPr>
     </w:rPrDefault>
     <w:pPrDefault/>
   </w:docDefaults>
-  <w:style w:type="paragraph" w:styleId="Title">
+  <w:latentStyles w:defLockedState="0" w:defUIPriority="99" w:defSemiHidden="0" w:defUnhideWhenUsed="0" w:defQFormat="0" w:count="376">
+    <w:lsdException w:name="Normal" w:uiPriority="0" w:qFormat="1"/>
+    <w:lsdException w:name="heading 1" w:uiPriority="9" w:qFormat="1"/>
+    <w:lsdException w:name="heading 2" w:semiHidden="1" w:uiPriority="9" w:unhideWhenUsed="1" w:qFormat="1"/>
+    <w:lsdException w:name="heading 3" w:semiHidden="1" w:uiPriority="9" w:unhideWhenUsed="1" w:qFormat="1"/>
+    <w:lsdException w:name="heading 4" w:semiHidden="1" w:uiPriority="9" w:unhideWhenUsed="1" w:qFormat="1"/>
+    <w:lsdException w:name="heading 5" w:semiHidden="1" w:uiPriority="9" w:unhideWhenUsed="1" w:qFormat="1"/>
+    <w:lsdException w:name="heading 6" w:semiHidden="1" w:uiPriority="9" w:unhideWhenUsed="1" w:qFormat="1"/>
+    <w:lsdException w:name="heading 7" w:semiHidden="1" w:uiPriority="9" w:unhideWhenUsed="1" w:qFormat="1"/>
+    <w:lsdException w:name="heading 8" w:semiHidden="1" w:uiPriority="9" w:unhideWhenUsed="1" w:qFormat="1"/>
+    <w:lsdException w:name="heading 9" w:semiHidden="1" w:uiPriority="9" w:unhideWhenUsed="1" w:qFormat="1"/>
+    <w:lsdException w:name="index 1" w:semiHidden="1" w:unhideWhenUsed="1"/>
+    <w:lsdException w:name="index 2" w:semiHidden="1" w:unhideWhenUsed="1"/>
+    <w:lsdException w:name="index 3" w:semiHidden="1" w:unhideWhenUsed="1"/>
+    <w:lsdException w:name="index 4" w:semiHidden="1" w:unhideWhenUsed="1"/>
+    <w:lsdException w:name="index 5" w:semiHidden="1" w:unhideWhenUsed="1"/>
+    <w:lsdException w:name="index 6" w:semiHidden="1" w:unhideWhenUsed="1"/>
+    <w:lsdException w:name="index 7" w:semiHidden="1" w:unhideWhenUsed="1"/>
+    <w:lsdException w:name="index 8" w:semiHidden="1" w:unhideWhenUsed="1"/>
+    <w:lsdException w:name="index 9" w:semiHidden="1" w:unhideWhenUsed="1"/>
+    <w:lsdException w:name="toc 1" w:semiHidden="1" w:uiPriority="39" w:unhideWhenUsed="1"/>
+    <w:lsdException w:name="toc 2" w:semiHidden="1" w:uiPriority="39" w:unhideWhenUsed="1"/>
+    <w:lsdException w:name="toc 3" w:semiHidden="1" w:uiPriority="39" w:unhideWhenUsed="1"/>
+    <w:lsdException w:name="toc 4" w:semiHidden="1" w:uiPriority="39" w:unhideWhenUsed="1"/>
+    <w:lsdException w:name="toc 5" w:semiHidden="1" w:uiPriority="39" w:unhideWhenUsed="1"/>
+    <w:lsdException w:name="toc 6" w:semiHidden="1" w:uiPriority="39" w:unhideWhenUsed="1"/>
+    <w:lsdException w:name="toc 7" w:semiHidden="1" w:uiPriority="39" w:unhideWhenUsed="1"/>
+    <w:lsdException w:name="toc 8" w:semiHidden="1" w:uiPriority="39" w:unhideWhenUsed="1"/>
+    <w:lsdException w:name="toc 9" w:semiHidden="1" w:uiPriority="39" w:unhideWhenUsed="1"/>
+    <w:lsdException w:name="Normal Indent" w:semiHidden="1" w:unhideWhenUsed="1"/>
+    <w:lsdException w:name="footnote text" w:semiHidden="1" w:unhideWhenUsed="1"/>
+    <w:lsdException w:name="annotation text" w:semiHidden="1" w:unhideWhenUsed="1"/>
+    <w:lsdException w:name="header" w:semiHidden="1" w:unhideWhenUsed="1"/>
+    <w:lsdException w:name="footer" w:semiHidden="1" w:unhideWhenUsed="1"/>
+    <w:lsdException w:name="index heading" w:semiHidden="1" w:unhideWhenUsed="1"/>
+    <w:lsdException w:name="caption" w:semiHidden="1" w:uiPriority="35" w:unhideWhenUsed="1" w:qFormat="1"/>
+    <w:lsdException w:name="table of figures" w:semiHidden="1" w:unhideWhenUsed="1"/>
+    <w:lsdException w:name="envelope address" w:semiHidden="1" w:unhideWhenUsed="1"/>
+    <w:lsdException w:name="envelope return" w:semiHidden="1" w:unhideWhenUsed="1"/>
+    <w:lsdException w:name="footnote reference" w:semiHidden="1" w:unhideWhenUsed="1"/>
+    <w:lsdException w:name="annotation reference" w:semiHidden="1" w:unhideWhenUsed="1"/>
+    <w:lsdException w:name="line number" w:semiHidden="1" w:unhideWhenUsed="1"/>
+    <w:lsdException w:name="page number" w:semiHidden="1" w:unhideWhenUsed="1"/>
+    <w:lsdException w:name="endnote reference" w:semiHidden="1" w:unhideWhenUsed="1"/>
+    <w:lsdException w:name="endnote text" w:semiHidden="1" w:unhideWhenUsed="1"/>
+    <w:lsdException w:name="table of authorities" w:semiHidden="1" w:unhideWhenUsed="1"/>
+    <w:lsdException w:name="macro" w:semiHidden="1" w:unhideWhenUsed="1"/>
+    <w:lsdException w:name="toa heading" w:semiHidden="1" w:unhideWhenUsed="1"/>
+    <w:lsdException w:name="List" w:semiHidden="1" w:unhideWhenUsed="1"/>
+    <w:lsdException w:name="List Bullet" w:semiHidden="1" w:unhideWhenUsed="1"/>
+    <w:lsdException w:name="List Number" w:semiHidden="1" w:unhideWhenUsed="1"/>
+    <w:lsdException w:name="List 2" w:semiHidden="1" w:unhideWhenUsed="1"/>
+    <w:lsdException w:name="List 3" w:semiHidden="1" w:unhideWhenUsed="1"/>
+    <w:lsdException w:name="List 4" w:semiHidden="1" w:unhideWhenUsed="1"/>
+    <w:lsdException w:name="List 5" w:semiHidden="1" w:unhideWhenUsed="1"/>
+    <w:lsdException w:name="List Bullet 2" w:semiHidden="1" w:unhideWhenUsed="1"/>
+    <w:lsdException w:name="List Bullet 3" w:semiHidden="1" w:unhideWhenUsed="1"/>
+    <w:lsdException w:name="List Bullet 4" w:semiHidden="1" w:unhideWhenUsed="1"/>
+    <w:lsdException w:name="List Bullet 5" w:semiHidden="1" w:unhideWhenUsed="1"/>
+    <w:lsdException w:name="List Number 2" w:semiHidden="1" w:unhideWhenUsed="1"/>
+    <w:lsdException w:name="List Number 3" w:semiHidden="1" w:unhideWhenUsed="1"/>
+    <w:lsdException w:name="List Number 4" w:semiHidden="1" w:unhideWhenUsed="1"/>
+    <w:lsdException w:name="List Number 5" w:semiHidden="1" w:unhideWhenUsed="1"/>
+    <w:lsdException w:name="Title" w:uiPriority="10" w:qFormat="1"/>
+    <w:lsdException w:name="Closing" w:semiHidden="1" w:unhideWhenUsed="1"/>
+    <w:lsdException w:name="Signature" w:semiHidden="1" w:unhideWhenUsed="1"/>
+    <w:lsdException w:name="Default Paragraph Font" w:semiHidden="1" w:uiPriority="1" w:unhideWhenUsed="1"/>
+    <w:lsdException w:name="Body Text" w:semiHidden="1" w:unhideWhenUsed="1"/>
+    <w:lsdException w:name="Body Text Indent" w:semiHidden="1" w:unhideWhenUsed="1"/>
+    <w:lsdException w:name="List Continue" w:semiHidden="1" w:unhideWhenUsed="1"/>
+    <w:lsdException w:name="List Continue 2" w:semiHidden="1" w:unhideWhenUsed="1"/>
+    <w:lsdException w:name="List Continue 3" w:semiHidden="1" w:unhideWhenUsed="1"/>
+    <w:lsdException w:name="List Continue 4" w:semiHidden="1" w:unhideWhenUsed="1"/>
+    <w:lsdException w:name="List Continue 5" w:semiHidden="1" w:unhideWhenUsed="1"/>
+    <w:lsdException w:name="Message Header" w:semiHidden="1" w:unhideWhenUsed="1"/>
+    <w:lsdException w:name="Subtitle" w:uiPriority="11" w:qFormat="1"/>
+    <w:lsdException w:name="Salutation" w:semiHidden="1" w:unhideWhenUsed="1"/>
+    <w:lsdException w:name="Date" w:semiHidden="1" w:unhideWhenUsed="1"/>
+    <w:lsdException w:name="Body Text First Indent" w:semiHidden="1" w:unhideWhenUsed="1"/>
+    <w:lsdException w:name="Body Text First Indent 2" w:semiHidden="1" w:unhideWhenUsed="1"/>
+    <w:lsdException w:name="Note Heading" w:semiHidden="1" w:unhideWhenUsed="1"/>
+    <w:lsdException w:name="Body Text 2" w:semiHidden="1" w:unhideWhenUsed="1"/>
+    <w:lsdException w:name="Body Text 3" w:semiHidden="1" w:unhideWhenUsed="1"/>
+    <w:lsdException w:name="Body Text Indent 2" w:semiHidden="1" w:unhideWhenUsed="1"/>
+    <w:lsdException w:name="Body Text Indent 3" w:semiHidden="1" w:unhideWhenUsed="1"/>
+    <w:lsdException w:name="Block Text" w:semiHidden="1" w:unhideWhenUsed="1"/>
+    <w:lsdException w:name="Hyperlink" w:semiHidden="1" w:unhideWhenUsed="1"/>
+    <w:lsdException w:name="FollowedHyperlink" w:semiHidden="1" w:unhideWhenUsed="1"/>
+    <w:lsdException w:name="Strong" w:uiPriority="22" w:qFormat="1"/>
+    <w:lsdException w:name="Emphasis" w:uiPriority="20" w:qFormat="1"/>
+    <w:lsdException w:name="Document Map" w:semiHidden="1" w:unhideWhenUsed="1"/>
+    <w:lsdException w:name="Plain Text" w:semiHidden="1" w:unhideWhenUsed="1"/>
+    <w:lsdException w:name="E-mail Signature" w:semiHidden="1" w:unhideWhenUsed="1"/>
+    <w:lsdException w:name="HTML Top of Form" w:semiHidden="1" w:unhideWhenUsed="1"/>
+    <w:lsdException w:name="HTML Bottom of Form" w:semiHidden="1" w:unhideWhenUsed="1"/>
+    <w:lsdException w:name="Normal (Web)" w:semiHidden="1" w:unhideWhenUsed="1"/>
+    <w:lsdException w:name="HTML Acronym" w:semiHidden="1" w:unhideWhenUsed="1"/>
+    <w:lsdException w:name="HTML Address" w:semiHidden="1" w:unhideWhenUsed="1"/>
+    <w:lsdException w:name="HTML Cite" w:semiHidden="1" w:unhideWhenUsed="1"/>
+    <w:lsdException w:name="HTML Code" w:semiHidden="1" w:unhideWhenUsed="1"/>
+    <w:lsdException w:name="HTML Definition" w:semiHidden="1" w:unhideWhenUsed="1"/>
+    <w:lsdException w:name="HTML Keyboard" w:semiHidden="1" w:unhideWhenUsed="1"/>
+    <w:lsdException w:name="HTML Preformatted" w:semiHidden="1" w:unhideWhenUsed="1"/>
+    <w:lsdException w:name="HTML Sample" w:semiHidden="1" w:unhideWhenUsed="1"/>
+    <w:lsdException w:name="HTML Typewriter" w:semiHidden="1" w:unhideWhenUsed="1"/>
+    <w:lsdException w:name="HTML Variable" w:semiHidden="1" w:unhideWhenUsed="1"/>
+    <w:lsdException w:name="Normal Table" w:semiHidden="1" w:unhideWhenUsed="1"/>
+    <w:lsdException w:name="annotation subject" w:semiHidden="1" w:unhideWhenUsed="1"/>
+    <w:lsdException w:name="No List" w:semiHidden="1" w:unhideWhenUsed="1"/>
+    <w:lsdException w:name="Outline List 1" w:semiHidden="1" w:unhideWhenUsed="1"/>
+    <w:lsdException w:name="Outline List 2" w:semiHidden="1" w:unhideWhenUsed="1"/>
+    <w:lsdException w:name="Outline List 3" w:semiHidden="1" w:unhideWhenUsed="1"/>
+    <w:lsdException w:name="Table Simple 1" w:semiHidden="1" w:unhideWhenUsed="1"/>
+    <w:lsdException w:name="Table Simple 2" w:semiHidden="1" w:unhideWhenUsed="1"/>
+    <w:lsdException w:name="Table Simple 3" w:semiHidden="1" w:unhideWhenUsed="1"/>
+    <w:lsdException w:name="Table Classic 1" w:semiHidden="1" w:unhideWhenUsed="1"/>
+    <w:lsdException w:name="Table Classic 2" w:semiHidden="1" w:unhideWhenUsed="1"/>
+    <w:lsdException w:name="Table Classic 3" w:semiHidden="1" w:unhideWhenUsed="1"/>
+    <w:lsdException w:name="Table Classic 4" w:semiHidden="1" w:unhideWhenUsed="1"/>
+    <w:lsdException w:name="Table Colorful 1" w:semiHidden="1" w:unhideWhenUsed="1"/>
+    <w:lsdException w:name="Table Colorful 2" w:semiHidden="1" w:unhideWhenUsed="1"/>
+    <w:lsdException w:name="Table Colorful 3" w:semiHidden="1" w:unhideWhenUsed="1"/>
+    <w:lsdException w:name="Table Columns 1" w:semiHidden="1" w:unhideWhenUsed="1"/>
+    <w:lsdException w:name="Table Columns 2" w:semiHidden="1" w:unhideWhenUsed="1"/>
+    <w:lsdException w:name="Table Columns 3" w:semiHidden="1" w:unhideWhenUsed="1"/>
+    <w:lsdException w:name="Table Columns 4" w:semiHidden="1" w:unhideWhenUsed="1"/>
+    <w:lsdException w:name="Table Columns 5" w:semiHidden="1" w:unhideWhenUsed="1"/>
+    <w:lsdException w:name="Table Grid 1" w:semiHidden="1" w:unhideWhenUsed="1"/>
+    <w:lsdException w:name="Table Grid 2" w:semiHidden="1" w:unhideWhenUsed="1"/>
+    <w:lsdException w:name="Table Grid 3" w:semiHidden="1" w:unhideWhenUsed="1"/>
+    <w:lsdException w:name="Table Grid 4" w:semiHidden="1" w:unhideWhenUsed="1"/>
+    <w:lsdException w:name="Table Grid 5" w:semiHidden="1" w:unhideWhenUsed="1"/>
+    <w:lsdException w:name="Table Grid 6" w:semiHidden="1" w:unhideWhenUsed="1"/>
+    <w:lsdException w:name="Table Grid 7" w:semiHidden="1" w:unhideWhenUsed="1"/>
+    <w:lsdException w:name="Table Grid 8" w:semiHidden="1" w:unhideWhenUsed="1"/>
+    <w:lsdException w:name="Table List 1" w:semiHidden="1" w:unhideWhenUsed="1"/>
+    <w:lsdException w:name="Table List 2" w:semiHidden="1" w:unhideWhenUsed="1"/>
+    <w:lsdException w:name="Table List 3" w:semiHidden="1" w:unhideWhenUsed="1"/>
+    <w:lsdException w:name="Table List 4" w:semiHidden="1" w:unhideWhenUsed="1"/>
+    <w:lsdException w:name="Table List 5" w:semiHidden="1" w:unhideWhenUsed="1"/>
+    <w:lsdException w:name="Table List 6" w:semiHidden="1" w:unhideWhenUsed="1"/>
+    <w:lsdException w:name="Table List 7" w:semiHidden="1" w:unhideWhenUsed="1"/>
+    <w:lsdException w:name="Table List 8" w:semiHidden="1" w:unhideWhenUsed="1"/>
+    <w:lsdException w:name="Table 3D effects 1" w:semiHidden="1" w:unhideWhenUsed="1"/>
+    <w:lsdException w:name="Table 3D effects 2" w:semiHidden="1" w:unhideWhenUsed="1"/>
+    <w:lsdException w:name="Table 3D effects 3" w:semiHidden="1" w:unhideWhenUsed="1"/>
+    <w:lsdException w:name="Table Contemporary" w:semiHidden="1" w:unhideWhenUsed="1"/>
+    <w:lsdException w:name="Table Elegant" w:semiHidden="1" w:unhideWhenUsed="1"/>
+    <w:lsdException w:name="Table Professional" w:semiHidden="1" w:unhideWhenUsed="1"/>
+    <w:lsdException w:name="Table Subtle 1" w:semiHidden="1" w:unhideWhenUsed="1"/>
+    <w:lsdException w:name="Table Subtle 2" w:semiHidden="1" w:unhideWhenUsed="1"/>
+    <w:lsdException w:name="Table Web 1" w:semiHidden="1" w:unhideWhenUsed="1"/>
+    <w:lsdException w:name="Table Web 2" w:semiHidden="1" w:unhideWhenUsed="1"/>
+    <w:lsdException w:name="Table Web 3" w:semiHidden="1" w:unhideWhenUsed="1"/>
+    <w:lsdException w:name="Balloon Text" w:semiHidden="1" w:unhideWhenUsed="1"/>
+    <w:lsdException w:name="Table Grid" w:uiPriority="39"/>
+    <w:lsdException w:name="Table Theme" w:semiHidden="1" w:unhideWhenUsed="1"/>
+    <w:lsdException w:name="Placeholder Text" w:semiHidden="1"/>
+    <w:lsdException w:name="No Spacing" w:uiPriority="1" w:qFormat="1"/>
+    <w:lsdException w:name="Light Shading" w:uiPriority="60"/>
+    <w:lsdException w:name="Light List" w:uiPriority="61"/>
+    <w:lsdException w:name="Light Grid" w:uiPriority="62"/>
+    <w:lsdException w:name="Medium Shading 1" w:uiPriority="63"/>
+    <w:lsdException w:name="Medium Shading 2" w:uiPriority="64"/>
+    <w:lsdException w:name="Medium List 1" w:uiPriority="65"/>
+    <w:lsdException w:name="Medium List 2" w:uiPriority="66"/>
+    <w:lsdException w:name="Medium Grid 1" w:uiPriority="67"/>
+    <w:lsdException w:name="Medium Grid 2" w:uiPriority="68"/>
+    <w:lsdException w:name="Medium Grid 3" w:uiPriority="69"/>
+    <w:lsdException w:name="Dark List" w:uiPriority="70"/>
+    <w:lsdException w:name="Colorful Shading" w:uiPriority="71"/>
+    <w:lsdException w:name="Colorful List" w:uiPriority="72"/>
+    <w:lsdException w:name="Colorful Grid" w:uiPriority="73"/>
+    <w:lsdException w:name="Light Shading Accent 1" w:uiPriority="60"/>
+    <w:lsdException w:name="Light List Accent 1" w:uiPriority="61"/>
+    <w:lsdException w:name="Light Grid Accent 1" w:uiPriority="62"/>
+    <w:lsdException w:name="Medium Shading 1 Accent 1" w:uiPriority="63"/>
+    <w:lsdException w:name="Medium Shading 2 Accent 1" w:uiPriority="64"/>
+    <w:lsdException w:name="Medium List 1 Accent 1" w:uiPriority="65"/>
+    <w:lsdException w:name="Revision" w:semiHidden="1"/>
+    <w:lsdException w:name="List Paragraph" w:uiPriority="34" w:qFormat="1"/>
+    <w:lsdException w:name="Quote" w:uiPriority="29" w:qFormat="1"/>
+    <w:lsdException w:name="Intense Quote" w:uiPriority="30" w:qFormat="1"/>
+    <w:lsdException w:name="Medium List 2 Accent 1" w:uiPriority="66"/>
+    <w:lsdException w:name="Medium Grid 1 Accent 1" w:uiPriority="67"/>
+    <w:lsdException w:name="Medium Grid 2 Accent 1" w:uiPriority="68"/>
+    <w:lsdException w:name="Medium Grid 3 Accent 1" w:uiPriority="69"/>
+    <w:lsdException w:name="Dark List Accent 1" w:uiPriority="70"/>
+    <w:lsdException w:name="Colorful Shading Accent 1" w:uiPriority="71"/>
+    <w:lsdException w:name="Colorful List Accent 1" w:uiPriority="72"/>
+    <w:lsdException w:name="Colorful Grid Accent 1" w:uiPriority="73"/>
+    <w:lsdException w:name="Light Shading Accent 2" w:uiPriority="60"/>
+    <w:lsdException w:name="Light List Accent 2" w:uiPriority="61"/>
+    <w:lsdException w:name="Light Grid Accent 2" w:uiPriority="62"/>
+    <w:lsdException w:name="Medium Shading 1 Accent 2" w:uiPriority="63"/>
+    <w:lsdException w:name="Medium Shading 2 Accent 2" w:uiPriority="64"/>
+    <w:lsdException w:name="Medium List 1 Accent 2" w:uiPriority="65"/>
+    <w:lsdException w:name="Medium List 2 Accent 2" w:uiPriority="66"/>
+    <w:lsdException w:name="Medium Grid 1 Accent 2" w:uiPriority="67"/>
+    <w:lsdException w:name="Medium Grid 2 Accent 2" w:uiPriority="68"/>
+    <w:lsdException w:name="Medium Grid 3 Accent 2" w:uiPriority="69"/>
+    <w:lsdException w:name="Dark List Accent 2" w:uiPriority="70"/>
+    <w:lsdException w:name="Colorful Shading Accent 2" w:uiPriority="71"/>
+    <w:lsdException w:name="Colorful List Accent 2" w:uiPriority="72"/>
+    <w:lsdException w:name="Colorful Grid Accent 2" w:uiPriority="73"/>
+    <w:lsdException w:name="Light Shading Accent 3" w:uiPriority="60"/>
+    <w:lsdException w:name="Light List Accent 3" w:uiPriority="61"/>
+    <w:lsdException w:name="Light Grid Accent 3" w:uiPriority="62"/>
+    <w:lsdException w:name="Medium Shading 1 Accent 3" w:uiPriority="63"/>
+    <w:lsdException w:name="Medium Shading 2 Accent 3" w:uiPriority="64"/>
+    <w:lsdException w:name="Medium List 1 Accent 3" w:uiPriority="65"/>
+    <w:lsdException w:name="Medium List 2 Accent 3" w:uiPriority="66"/>
+    <w:lsdException w:name="Medium Grid 1 Accent 3" w:uiPriority="67"/>
+    <w:lsdException w:name="Medium Grid 2 Accent 3" w:uiPriority="68"/>
+    <w:lsdException w:name="Medium Grid 3 Accent 3" w:uiPriority="69"/>
+    <w:lsdException w:name="Dark List Accent 3" w:uiPriority="70"/>
+    <w:lsdException w:name="Colorful Shading Accent 3" w:uiPriority="71"/>
+    <w:lsdException w:name="Colorful List Accent 3" w:uiPriority="72"/>
+    <w:lsdException w:name="Colorful Grid Accent 3" w:uiPriority="73"/>
+    <w:lsdException w:name="Light Shading Accent 4" w:uiPriority="60"/>
+    <w:lsdException w:name="Light List Accent 4" w:uiPriority="61"/>
+    <w:lsdException w:name="Light Grid Accent 4" w:uiPriority="62"/>
+    <w:lsdException w:name="Medium Shading 1 Accent 4" w:uiPriority="63"/>
+    <w:lsdException w:name="Medium Shading 2 Accent 4" w:uiPriority="64"/>
+    <w:lsdException w:name="Medium List 1 Accent 4" w:uiPriority="65"/>
+    <w:lsdException w:name="Medium List 2 Accent 4" w:uiPriority="66"/>
+    <w:lsdException w:name="Medium Grid 1 Accent 4" w:uiPriority="67"/>
+    <w:lsdException w:name="Medium Grid 2 Accent 4" w:uiPriority="68"/>
+    <w:lsdException w:name="Medium Grid 3 Accent 4" w:uiPriority="69"/>
+    <w:lsdException w:name="Dark List Accent 4" w:uiPriority="70"/>
+    <w:lsdException w:name="Colorful Shading Accent 4" w:uiPriority="71"/>
+    <w:lsdException w:name="Colorful List Accent 4" w:uiPriority="72"/>
+    <w:lsdException w:name="Colorful Grid Accent 4" w:uiPriority="73"/>
+    <w:lsdException w:name="Light Shading Accent 5" w:uiPriority="60"/>
+    <w:lsdException w:name="Light List Accent 5" w:uiPriority="61"/>
+    <w:lsdException w:name="Light Grid Accent 5" w:uiPriority="62"/>
+    <w:lsdException w:name="Medium Shading 1 Accent 5" w:uiPriority="63"/>
+    <w:lsdException w:name="Medium Shading 2 Accent 5" w:uiPriority="64"/>
+    <w:lsdException w:name="Medium List 1 Accent 5" w:uiPriority="65"/>
+    <w:lsdException w:name="Medium List 2 Accent 5" w:uiPriority="66"/>
+    <w:lsdException w:name="Medium Grid 1 Accent 5" w:uiPriority="67"/>
+    <w:lsdException w:name="Medium Grid 2 Accent 5" w:uiPriority="68"/>
+    <w:lsdException w:name="Medium Grid 3 Accent 5" w:uiPriority="69"/>
+    <w:lsdException w:name="Dark List Accent 5" w:uiPriority="70"/>
+    <w:lsdException w:name="Colorful Shading Accent 5" w:uiPriority="71"/>
+    <w:lsdException w:name="Colorful List Accent 5" w:uiPriority="72"/>
+    <w:lsdException w:name="Colorful Grid Accent 5" w:uiPriority="73"/>
+    <w:lsdException w:name="Light Shading Accent 6" w:uiPriority="60"/>
+    <w:lsdException w:name="Light List Accent 6" w:uiPriority="61"/>
+    <w:lsdException w:name="Light Grid Accent 6" w:uiPriority="62"/>
+    <w:lsdException w:name="Medium Shading 1 Accent 6" w:uiPriority="63"/>
+    <w:lsdException w:name="Medium Shading 2 Accent 6" w:uiPriority="64"/>
+    <w:lsdException w:name="Medium List 1 Accent 6" w:uiPriority="65"/>
+    <w:lsdException w:name="Medium List 2 Accent 6" w:uiPriority="66"/>
+    <w:lsdException w:name="Medium Grid 1 Accent 6" w:uiPriority="67"/>
+    <w:lsdException w:name="Medium Grid 2 Accent 6" w:uiPriority="68"/>
+    <w:lsdException w:name="Medium Grid 3 Accent 6" w:uiPriority="69"/>
+    <w:lsdException w:name="Dark List Accent 6" w:uiPriority="70"/>
+    <w:lsdException w:name="Colorful Shading Accent 6" w:uiPriority="71"/>
+    <w:lsdException w:name="Colorful List Accent 6" w:uiPriority="72"/>
+    <w:lsdException w:name="Colorful Grid Accent 6" w:uiPriority="73"/>
+    <w:lsdException w:name="Subtle Emphasis" w:uiPriority="19" w:qFormat="1"/>
+    <w:lsdException w:name="Intense Emphasis" w:uiPriority="21" w:qFormat="1"/>
+    <w:lsdException w:name="Subtle Reference" w:uiPriority="31" w:qFormat="1"/>
+    <w:lsdException w:name="Intense Reference" w:uiPriority="32" w:qFormat="1"/>
+    <w:lsdException w:name="Book Title" w:uiPriority="33" w:qFormat="1"/>
+    <w:lsdException w:name="Bibliography" w:semiHidden="1" w:uiPriority="37" w:unhideWhenUsed="1"/>
+    <w:lsdException w:name="TOC Heading" w:semiHidden="1" w:uiPriority="39" w:unhideWhenUsed="1" w:qFormat="1"/>
+    <w:lsdException w:name="Plain Table 1" w:uiPriority="41"/>
+    <w:lsdException w:name="Plain Table 2" w:uiPriority="42"/>
+    <w:lsdException w:name="Plain Table 3" w:uiPriority="43"/>
+    <w:lsdException w:name="Plain Table 4" w:uiPriority="44"/>
+    <w:lsdException w:name="Plain Table 5" w:uiPriority="45"/>
+    <w:lsdException w:name="Grid Table Light" w:uiPriority="40"/>
+    <w:lsdException w:name="Grid Table 1 Light" w:uiPriority="46"/>
+    <w:lsdException w:name="Grid Table 2" w:uiPriority="47"/>
+    <w:lsdException w:name="Grid Table 3" w:uiPriority="48"/>
+    <w:lsdException w:name="Grid Table 4" w:uiPriority="49"/>
+    <w:lsdException w:name="Grid Table 5 Dark" w:uiPriority="50"/>
+    <w:lsdException w:name="Grid Table 6 Colorful" w:uiPriority="51"/>
+    <w:lsdException w:name="Grid Table 7 Colorful" w:uiPriority="52"/>
+    <w:lsdException w:name="Grid Table 1 Light Accent 1" w:uiPriority="46"/>
+    <w:lsdException w:name="Grid Table 2 Accent 1" w:uiPriority="47"/>
+    <w:lsdException w:name="Grid Table 3 Accent 1" w:uiPriority="48"/>
+    <w:lsdException w:name="Grid Table 4 Accent 1" w:uiPriority="49"/>
+    <w:lsdException w:name="Grid Table 5 Dark Accent 1" w:uiPriority="50"/>
+    <w:lsdException w:name="Grid Table 6 Colorful Accent 1" w:uiPriority="51"/>
+    <w:lsdException w:name="Grid Table 7 Colorful Accent 1" w:uiPriority="52"/>
+    <w:lsdException w:name="Grid Table 1 Light Accent 2" w:uiPriority="46"/>
+    <w:lsdException w:name="Grid Table 2 Accent 2" w:uiPriority="47"/>
+    <w:lsdException w:name="Grid Table 3 Accent 2" w:uiPriority="48"/>
+    <w:lsdException w:name="Grid Table 4 Accent 2" w:uiPriority="49"/>
+    <w:lsdException w:name="Grid Table 5 Dark Accent 2" w:uiPriority="50"/>
+    <w:lsdException w:name="Grid Table 6 Colorful Accent 2" w:uiPriority="51"/>
+    <w:lsdException w:name="Grid Table 7 Colorful Accent 2" w:uiPriority="52"/>
+    <w:lsdException w:name="Grid Table 1 Light Accent 3" w:uiPriority="46"/>
+    <w:lsdException w:name="Grid Table 2 Accent 3" w:uiPriority="47"/>
+    <w:lsdException w:name="Grid Table 3 Accent 3" w:uiPriority="48"/>
+    <w:lsdException w:name="Grid Table 4 Accent 3" w:uiPriority="49"/>
+    <w:lsdException w:name="Grid Table 5 Dark Accent 3" w:uiPriority="50"/>
+    <w:lsdException w:name="Grid Table 6 Colorful Accent 3" w:uiPriority="51"/>
+    <w:lsdException w:name="Grid Table 7 Colorful Accent 3" w:uiPriority="52"/>
+    <w:lsdException w:name="Grid Table 1 Light Accent 4" w:uiPriority="46"/>
+    <w:lsdException w:name="Grid Table 2 Accent 4" w:uiPriority="47"/>
+    <w:lsdException w:name="Grid Table 3 Accent 4" w:uiPriority="48"/>
+    <w:lsdException w:name="Grid Table 4 Accent 4" w:uiPriority="49"/>
+    <w:lsdException w:name="Grid Table 5 Dark Accent 4" w:uiPriority="50"/>
+    <w:lsdException w:name="Grid Table 6 Colorful Accent 4" w:uiPriority="51"/>
+    <w:lsdException w:name="Grid Table 7 Colorful Accent 4" w:uiPriority="52"/>
+    <w:lsdException w:name="Grid Table 1 Light Accent 5" w:uiPriority="46"/>
+    <w:lsdException w:name="Grid Table 2 Accent 5" w:uiPriority="47"/>
+    <w:lsdException w:name="Grid Table 3 Accent 5" w:uiPriority="48"/>
+    <w:lsdException w:name="Grid Table 4 Accent 5" w:uiPriority="49"/>
+    <w:lsdException w:name="Grid Table 5 Dark Accent 5" w:uiPriority="50"/>
+    <w:lsdException w:name="Grid Table 6 Colorful Accent 5" w:uiPriority="51"/>
+    <w:lsdException w:name="Grid Table 7 Colorful Accent 5" w:uiPriority="52"/>
+    <w:lsdException w:name="Grid Table 1 Light Accent 6" w:uiPriority="46"/>
+    <w:lsdException w:name="Grid Table 2 Accent 6" w:uiPriority="47"/>
+    <w:lsdException w:name="Grid Table 3 Accent 6" w:uiPriority="48"/>
+    <w:lsdException w:name="Grid Table 4 Accent 6" w:uiPriority="49"/>
+    <w:lsdException w:name="Grid Table 5 Dark Accent 6" w:uiPriority="50"/>
+    <w:lsdException w:name="Grid Table 6 Colorful Accent 6" w:uiPriority="51"/>
+    <w:lsdException w:name="Grid Table 7 Colorful Accent 6" w:uiPriority="52"/>
+    <w:lsdException w:name="List Table 1 Light" w:uiPriority="46"/>
+    <w:lsdException w:name="List Table 2" w:uiPriority="47"/>
+    <w:lsdException w:name="List Table 3" w:uiPriority="48"/>
+    <w:lsdException w:name="List Table 4" w:uiPriority="49"/>
+    <w:lsdException w:name="List Table 5 Dark" w:uiPriority="50"/>
+    <w:lsdException w:name="List Table 6 Colorful" w:uiPriority="51"/>
+    <w:lsdException w:name="List Table 7 Colorful" w:uiPriority="52"/>
+    <w:lsdException w:name="List Table 1 Light Accent 1" w:uiPriority="46"/>
+    <w:lsdException w:name="List Table 2 Accent 1" w:uiPriority="47"/>
+    <w:lsdException w:name="List Table 3 Accent 1" w:uiPriority="48"/>
+    <w:lsdException w:name="List Table 4 Accent 1" w:uiPriority="49"/>
+    <w:lsdException w:name="List Table 5 Dark Accent 1" w:uiPriority="50"/>
+    <w:lsdException w:name="List Table 6 Colorful Accent 1" w:uiPriority="51"/>
+    <w:lsdException w:name="List Table 7 Colorful Accent 1" w:uiPriority="52"/>
+    <w:lsdException w:name="List Table 1 Light Accent 2" w:uiPriority="46"/>
+    <w:lsdException w:name="List Table 2 Accent 2" w:uiPriority="47"/>
+    <w:lsdException w:name="List Table 3 Accent 2" w:uiPriority="48"/>
+    <w:lsdException w:name="List Table 4 Accent 2" w:uiPriority="49"/>
+    <w:lsdException w:name="List Table 5 Dark Accent 2" w:uiPriority="50"/>
+    <w:lsdException w:name="List Table 6 Colorful Accent 2" w:uiPriority="51"/>
+    <w:lsdException w:name="List Table 7 Colorful Accent 2" w:uiPriority="52"/>
+    <w:lsdException w:name="List Table 1 Light Accent 3" w:uiPriority="46"/>
+    <w:lsdException w:name="List Table 2 Accent 3" w:uiPriority="47"/>
+    <w:lsdException w:name="List Table 3 Accent 3" w:uiPriority="48"/>
+    <w:lsdException w:name="List Table 4 Accent 3" w:uiPriority="49"/>
+    <w:lsdException w:name="List Table 5 Dark Accent 3" w:uiPriority="50"/>
+    <w:lsdException w:name="List Table 6 Colorful Accent 3" w:uiPriority="51"/>
+    <w:lsdException w:name="List Table 7 Colorful Accent 3" w:uiPriority="52"/>
+    <w:lsdException w:name="List Table 1 Light Accent 4" w:uiPriority="46"/>
+    <w:lsdException w:name="List Table 2 Accent 4" w:uiPriority="47"/>
+    <w:lsdException w:name="List Table 3 Accent 4" w:uiPriority="48"/>
+    <w:lsdException w:name="List Table 4 Accent 4" w:uiPriority="49"/>
+    <w:lsdException w:name="List Table 5 Dark Accent 4" w:uiPriority="50"/>
+    <w:lsdException w:name="List Table 6 Colorful Accent 4" w:uiPriority="51"/>
+    <w:lsdException w:name="List Table 7 Colorful Accent 4" w:uiPriority="52"/>
+    <w:lsdException w:name="List Table 1 Light Accent 5" w:uiPriority="46"/>
+    <w:lsdException w:name="List Table 2 Accent 5" w:uiPriority="47"/>
+    <w:lsdException w:name="List Table 3 Accent 5" w:uiPriority="48"/>
+    <w:lsdException w:name="List Table 4 Accent 5" w:uiPriority="49"/>
+    <w:lsdException w:name="List Table 5 Dark Accent 5" w:uiPriority="50"/>
+    <w:lsdException w:name="List Table 6 Colorful Accent 5" w:uiPriority="51"/>
+    <w:lsdException w:name="List Table 7 Colorful Accent 5" w:uiPriority="52"/>
+    <w:lsdException w:name="List Table 1 Light Accent 6" w:uiPriority="46"/>
+    <w:lsdException w:name="List Table 2 Accent 6" w:uiPriority="47"/>
+    <w:lsdException w:name="List Table 3 Accent 6" w:uiPriority="48"/>
+    <w:lsdException w:name="List Table 4 Accent 6" w:uiPriority="49"/>
+    <w:lsdException w:name="List Table 5 Dark Accent 6" w:uiPriority="50"/>
+    <w:lsdException w:name="List Table 6 Colorful Accent 6" w:uiPriority="51"/>
+    <w:lsdException w:name="List Table 7 Colorful Accent 6" w:uiPriority="52"/>
+    <w:lsdException w:name="Mention" w:semiHidden="1" w:unhideWhenUsed="1"/>
+    <w:lsdException w:name="Smart Hyperlink" w:semiHidden="1" w:unhideWhenUsed="1"/>
+    <w:lsdException w:name="Hashtag" w:semiHidden="1" w:unhideWhenUsed="1"/>
+    <w:lsdException w:name="Unresolved Mention" w:semiHidden="1" w:unhideWhenUsed="1"/>
+    <w:lsdException w:name="Smart Link" w:semiHidden="1" w:unhideWhenUsed="1"/>
+  </w:latentStyles>
+  <w:style w:type="paragraph" w:default="1" w:styleId="Normal">
+    <w:name w:val="Normal"/>
+    <w:qFormat/>
+  </w:style>
+  <w:style w:type="paragraph" w:styleId="Ttulo1">
+    <w:name w:val="heading 1"/>
+    <w:uiPriority w:val="9"/>
+    <w:qFormat/>
+    <w:pPr>
+      <w:outlineLvl w:val="0"/>
+    </w:pPr>
+    <w:rPr>
+      <w:color w:val="2E74B5"/>
+      <w:sz w:val="32"/>
+      <w:szCs w:val="32"/>
+    </w:rPr>
+  </w:style>
+  <w:style w:type="paragraph" w:styleId="Ttulo2">
+    <w:name w:val="heading 2"/>
+    <w:uiPriority w:val="9"/>
+    <w:semiHidden/>
+    <w:unhideWhenUsed/>
+    <w:qFormat/>
+    <w:pPr>
+      <w:outlineLvl w:val="1"/>
+    </w:pPr>
+    <w:rPr>
+      <w:color w:val="2E74B5"/>
+      <w:sz w:val="26"/>
+      <w:szCs w:val="26"/>
+    </w:rPr>
+  </w:style>
+  <w:style w:type="paragraph" w:styleId="Ttulo3">
+    <w:name w:val="heading 3"/>
+    <w:uiPriority w:val="9"/>
+    <w:semiHidden/>
+    <w:unhideWhenUsed/>
+    <w:qFormat/>
+    <w:pPr>
+      <w:outlineLvl w:val="2"/>
+    </w:pPr>
+    <w:rPr>
+      <w:color w:val="1F4D78"/>
+      <w:sz w:val="24"/>
+      <w:szCs w:val="24"/>
+    </w:rPr>
+  </w:style>
+  <w:style w:type="paragraph" w:styleId="Ttulo4">
+    <w:name w:val="heading 4"/>
+    <w:uiPriority w:val="9"/>
+    <w:semiHidden/>
+    <w:unhideWhenUsed/>
+    <w:qFormat/>
+    <w:pPr>
+      <w:outlineLvl w:val="3"/>
+    </w:pPr>
+    <w:rPr>
+      <w:i/>
+      <w:iCs/>
+      <w:color w:val="2E74B5"/>
+    </w:rPr>
+  </w:style>
+  <w:style w:type="paragraph" w:styleId="Ttulo5">
+    <w:name w:val="heading 5"/>
+    <w:uiPriority w:val="9"/>
+    <w:semiHidden/>
+    <w:unhideWhenUsed/>
+    <w:qFormat/>
+    <w:pPr>
+      <w:outlineLvl w:val="4"/>
+    </w:pPr>
+    <w:rPr>
+      <w:color w:val="2E74B5"/>
+    </w:rPr>
+  </w:style>
+  <w:style w:type="paragraph" w:styleId="Ttulo6">
+    <w:name w:val="heading 6"/>
+    <w:uiPriority w:val="9"/>
+    <w:semiHidden/>
+    <w:unhideWhenUsed/>
+    <w:qFormat/>
+    <w:pPr>
+      <w:outlineLvl w:val="5"/>
+    </w:pPr>
+    <w:rPr>
+      <w:color w:val="1F4D78"/>
+    </w:rPr>
+  </w:style>
+  <w:style w:type="character" w:default="1" w:styleId="Fuentedeprrafopredeter">
+    <w:name w:val="Default Paragraph Font"/>
+    <w:uiPriority w:val="1"/>
+    <w:semiHidden/>
+    <w:unhideWhenUsed/>
+  </w:style>
+  <w:style w:type="table" w:default="1" w:styleId="Tablanormal">
+    <w:name w:val="Normal Table"/>
+    <w:uiPriority w:val="99"/>
+    <w:semiHidden/>
+    <w:unhideWhenUsed/>
+    <w:tblPr>
+      <w:tblInd w:w="0" w:type="dxa"/>
+      <w:tblCellMar>
+        <w:top w:w="0" w:type="dxa"/>
+        <w:left w:w="108" w:type="dxa"/>
+        <w:bottom w:w="0" w:type="dxa"/>
+        <w:right w:w="108" w:type="dxa"/>
+      </w:tblCellMar>
+    </w:tblPr>
+  </w:style>
+  <w:style w:type="numbering" w:default="1" w:styleId="Sinlista">
+    <w:name w:val="No List"/>
+    <w:uiPriority w:val="99"/>
+    <w:semiHidden/>
+    <w:unhideWhenUsed/>
+  </w:style>
+  <w:style w:type="paragraph" w:styleId="Ttulo">
     <w:name w:val="Title"/>
-    <w:basedOn w:val="Normal"/>
-    <w:next w:val="Normal"/>
+    <w:uiPriority w:val="10"/>
     <w:qFormat/>
     <w:rPr>
       <w:sz w:val="56"/>
       <w:szCs w:val="56"/>
     </w:rPr>
   </w:style>
-  <w:style w:type="paragraph" w:styleId="Heading1">
-    <w:name w:val="Heading 1"/>
-    <w:basedOn w:val="Normal"/>
-    <w:next w:val="Normal"/>
-    <w:qFormat/>
-    <w:rPr>
-      <w:color w:val="2E74B5"/>
-      <w:sz w:val="32"/>
-      <w:szCs w:val="32"/>
-    </w:rPr>
-  </w:style>
-  <w:style w:type="paragraph" w:styleId="Heading2">
-    <w:name w:val="Heading 2"/>
-    <w:basedOn w:val="Normal"/>
-    <w:next w:val="Normal"/>
-    <w:qFormat/>
-    <w:rPr>
-      <w:color w:val="2E74B5"/>
-      <w:sz w:val="26"/>
-      <w:szCs w:val="26"/>
-    </w:rPr>
-  </w:style>
-  <w:style w:type="paragraph" w:styleId="Heading3">
-    <w:name w:val="Heading 3"/>
-    <w:basedOn w:val="Normal"/>
-    <w:next w:val="Normal"/>
-    <w:qFormat/>
-    <w:rPr>
-      <w:color w:val="1F4D78"/>
-      <w:sz w:val="24"/>
-      <w:szCs w:val="24"/>
-    </w:rPr>
-  </w:style>
-  <w:style w:type="paragraph" w:styleId="Heading4">
-    <w:name w:val="Heading 4"/>
-    <w:basedOn w:val="Normal"/>
-    <w:next w:val="Normal"/>
-    <w:qFormat/>
-    <w:rPr>
-      <w:i/>
-      <w:iCs/>
-      <w:color w:val="2E74B5"/>
-    </w:rPr>
-  </w:style>
-  <w:style w:type="paragraph" w:styleId="Heading5">
-    <w:name w:val="Heading 5"/>
-    <w:basedOn w:val="Normal"/>
-    <w:next w:val="Normal"/>
-    <w:qFormat/>
-    <w:rPr>
-      <w:color w:val="2E74B5"/>
-    </w:rPr>
-  </w:style>
-  <w:style w:type="paragraph" w:styleId="Heading6">
-    <w:name w:val="Heading 6"/>
-    <w:basedOn w:val="Normal"/>
-    <w:next w:val="Normal"/>
-    <w:qFormat/>
-    <w:rPr>
-      <w:color w:val="1F4D78"/>
-    </w:rPr>
-  </w:style>
-  <w:style w:type="paragraph" w:styleId="Strong">
-    <w:name w:val="Strong"/>
-    <w:basedOn w:val="Normal"/>
-    <w:next w:val="Normal"/>
+  <w:style w:type="paragraph" w:customStyle="1" w:styleId="Fuerte1">
+    <w:name w:val="Fuerte1"/>
     <w:qFormat/>
     <w:rPr>
       <w:b/>
       <w:bCs/>
     </w:rPr>
   </w:style>
-  <w:style w:type="paragraph" w:styleId="ListParagraph">
+  <w:style w:type="paragraph" w:styleId="Prrafodelista">
     <w:name w:val="List Paragraph"/>
-    <w:basedOn w:val="Normal"/>
     <w:qFormat/>
   </w:style>
-  <w:style w:type="character" w:styleId="Hyperlink">
+  <w:style w:type="character" w:styleId="Hipervnculo">
     <w:name w:val="Hyperlink"/>
-    <w:basedOn w:val="DefaultParagraphFont"/>
     <w:uiPriority w:val="99"/>
     <w:unhideWhenUsed/>
     <w:rPr>
+      <w:color w:val="0563C1"/>
       <w:u w:val="single"/>
-      <w:color w:val="0563C1"/>
     </w:rPr>
   </w:style>
-  <w:style w:type="character" w:styleId="FootnoteReference">
+  <w:style w:type="character" w:styleId="Refdenotaalpie">
     <w:name w:val="footnote reference"/>
-    <w:basedOn w:val="DefaultParagraphFont"/>
     <w:uiPriority w:val="99"/>
     <w:semiHidden/>
     <w:unhideWhenUsed/>
@@ -2182,25 +2321,20 @@
       <w:vertAlign w:val="superscript"/>
     </w:rPr>
   </w:style>
-  <w:style w:type="paragraph" w:styleId="FootnoteText">
+  <w:style w:type="paragraph" w:styleId="Textonotapie">
     <w:name w:val="footnote text"/>
-    <w:basedOn w:val="Normal"/>
-    <w:link w:val="FootnoteTextChar"/>
+    <w:link w:val="TextonotapieCar"/>
     <w:uiPriority w:val="99"/>
     <w:semiHidden/>
     <w:unhideWhenUsed/>
-    <w:pPr>
-      <w:spacing w:after="0" w:line="240" w:lineRule="auto"/>
-    </w:pPr>
     <w:rPr>
       <w:sz w:val="20"/>
       <w:szCs w:val="20"/>
     </w:rPr>
   </w:style>
-  <w:style w:type="character" w:styleId="FootnoteTextChar">
-    <w:name w:val="Footnote Text Char"/>
-    <w:basedOn w:val="DefaultParagraphFont"/>
-    <w:link w:val="FootnoteText"/>
+  <w:style w:type="character" w:customStyle="1" w:styleId="TextonotapieCar">
+    <w:name w:val="Texto nota pie Car"/>
+    <w:link w:val="Textonotapie"/>
     <w:uiPriority w:val="99"/>
     <w:semiHidden/>
     <w:unhideWhenUsed/>
@@ -2210,4 +2344,319 @@
     </w:rPr>
   </w:style>
 </w:styles>
+</file>
+
+<file path=word/theme/theme1.xml><?xml version="1.0" encoding="utf-8"?>
+<a:theme xmlns:a="http://schemas.openxmlformats.org/drawingml/2006/main" name="Tema de Office">
+  <a:themeElements>
+    <a:clrScheme name="Office">
+      <a:dk1>
+        <a:sysClr val="windowText" lastClr="000000"/>
+      </a:dk1>
+      <a:lt1>
+        <a:sysClr val="window" lastClr="FFFFFF"/>
+      </a:lt1>
+      <a:dk2>
+        <a:srgbClr val="0E2841"/>
+      </a:dk2>
+      <a:lt2>
+        <a:srgbClr val="E8E8E8"/>
+      </a:lt2>
+      <a:accent1>
+        <a:srgbClr val="156082"/>
+      </a:accent1>
+      <a:accent2>
+        <a:srgbClr val="E97132"/>
+      </a:accent2>
+      <a:accent3>
+        <a:srgbClr val="196B24"/>
+      </a:accent3>
+      <a:accent4>
+        <a:srgbClr val="0F9ED5"/>
+      </a:accent4>
+      <a:accent5>
+        <a:srgbClr val="A02B93"/>
+      </a:accent5>
+      <a:accent6>
+        <a:srgbClr val="4EA72E"/>
+      </a:accent6>
+      <a:hlink>
+        <a:srgbClr val="467886"/>
+      </a:hlink>
+      <a:folHlink>
+        <a:srgbClr val="96607D"/>
+      </a:folHlink>
+    </a:clrScheme>
+    <a:fontScheme name="Office">
+      <a:majorFont>
+        <a:latin typeface="Aptos Display" panose="02110004020202020204"/>
+        <a:ea typeface=""/>
+        <a:cs typeface=""/>
+        <a:font script="Jpan" typeface="游ゴシック Light"/>
+        <a:font script="Hang" typeface="맑은 고딕"/>
+        <a:font script="Hans" typeface="等线 Light"/>
+        <a:font script="Hant" typeface="新細明體"/>
+        <a:font script="Arab" typeface="Times New Roman"/>
+        <a:font script="Hebr" typeface="Times New Roman"/>
+        <a:font script="Thai" typeface="Angsana New"/>
+        <a:font script="Ethi" typeface="Nyala"/>
+        <a:font script="Beng" typeface="Vrinda"/>
+        <a:font script="Gujr" typeface="Shruti"/>
+        <a:font script="Khmr" typeface="MoolBoran"/>
+        <a:font script="Knda" typeface="Tunga"/>
+        <a:font script="Guru" typeface="Raavi"/>
+        <a:font script="Cans" typeface="Euphemia"/>
+        <a:font script="Cher" typeface="Plantagenet Cherokee"/>
+        <a:font script="Yiii" typeface="Microsoft Yi Baiti"/>
+        <a:font script="Tibt" typeface="Microsoft Himalaya"/>
+        <a:font script="Thaa" typeface="MV Boli"/>
+        <a:font script="Deva" typeface="Mangal"/>
+        <a:font script="Telu" typeface="Gautami"/>
+        <a:font script="Taml" typeface="Latha"/>
+        <a:font script="Syrc" typeface="Estrangelo Edessa"/>
+        <a:font script="Orya" typeface="Kalinga"/>
+        <a:font script="Mlym" typeface="Kartika"/>
+        <a:font script="Laoo" typeface="DokChampa"/>
+        <a:font script="Sinh" typeface="Iskoola Pota"/>
+        <a:font script="Mong" typeface="Mongolian Baiti"/>
+        <a:font script="Viet" typeface="Times New Roman"/>
+        <a:font script="Uigh" typeface="Microsoft Uighur"/>
+        <a:font script="Geor" typeface="Sylfaen"/>
+        <a:font script="Armn" typeface="Arial"/>
+        <a:font script="Bugi" typeface="Leelawadee UI"/>
+        <a:font script="Bopo" typeface="Microsoft JhengHei"/>
+        <a:font script="Java" typeface="Javanese Text"/>
+        <a:font script="Lisu" typeface="Segoe UI"/>
+        <a:font script="Mymr" typeface="Myanmar Text"/>
+        <a:font script="Nkoo" typeface="Ebrima"/>
+        <a:font script="Olck" typeface="Nirmala UI"/>
+        <a:font script="Osma" typeface="Ebrima"/>
+        <a:font script="Phag" typeface="Phagspa"/>
+        <a:font script="Syrn" typeface="Estrangelo Edessa"/>
+        <a:font script="Syrj" typeface="Estrangelo Edessa"/>
+        <a:font script="Syre" typeface="Estrangelo Edessa"/>
+        <a:font script="Sora" typeface="Nirmala UI"/>
+        <a:font script="Tale" typeface="Microsoft Tai Le"/>
+        <a:font script="Talu" typeface="Microsoft New Tai Lue"/>
+        <a:font script="Tfng" typeface="Ebrima"/>
+      </a:majorFont>
+      <a:minorFont>
+        <a:latin typeface="Aptos" panose="02110004020202020204"/>
+        <a:ea typeface=""/>
+        <a:cs typeface=""/>
+        <a:font script="Jpan" typeface="游明朝"/>
+        <a:font script="Hang" typeface="맑은 고딕"/>
+        <a:font script="Hans" typeface="等线"/>
+        <a:font script="Hant" typeface="新細明體"/>
+        <a:font script="Arab" typeface="Arial"/>
+        <a:font script="Hebr" typeface="Arial"/>
+        <a:font script="Thai" typeface="Cordia New"/>
+        <a:font script="Ethi" typeface="Nyala"/>
+        <a:font script="Beng" typeface="Vrinda"/>
+        <a:font script="Gujr" typeface="Shruti"/>
+        <a:font script="Khmr" typeface="DaunPenh"/>
+        <a:font script="Knda" typeface="Tunga"/>
+        <a:font script="Guru" typeface="Raavi"/>
+        <a:font script="Cans" typeface="Euphemia"/>
+        <a:font script="Cher" typeface="Plantagenet Cherokee"/>
+        <a:font script="Yiii" typeface="Microsoft Yi Baiti"/>
+        <a:font script="Tibt" typeface="Microsoft Himalaya"/>
+        <a:font script="Thaa" typeface="MV Boli"/>
+        <a:font script="Deva" typeface="Mangal"/>
+        <a:font script="Telu" typeface="Gautami"/>
+        <a:font script="Taml" typeface="Latha"/>
+        <a:font script="Syrc" typeface="Estrangelo Edessa"/>
+        <a:font script="Orya" typeface="Kalinga"/>
+        <a:font script="Mlym" typeface="Kartika"/>
+        <a:font script="Laoo" typeface="DokChampa"/>
+        <a:font script="Sinh" typeface="Iskoola Pota"/>
+        <a:font script="Mong" typeface="Mongolian Baiti"/>
+        <a:font script="Viet" typeface="Arial"/>
+        <a:font script="Uigh" typeface="Microsoft Uighur"/>
+        <a:font script="Geor" typeface="Sylfaen"/>
+        <a:font script="Armn" typeface="Arial"/>
+        <a:font script="Bugi" typeface="Leelawadee UI"/>
+        <a:font script="Bopo" typeface="Microsoft JhengHei"/>
+        <a:font script="Java" typeface="Javanese Text"/>
+        <a:font script="Lisu" typeface="Segoe UI"/>
+        <a:font script="Mymr" typeface="Myanmar Text"/>
+        <a:font script="Nkoo" typeface="Ebrima"/>
+        <a:font script="Olck" typeface="Nirmala UI"/>
+        <a:font script="Osma" typeface="Ebrima"/>
+        <a:font script="Phag" typeface="Phagspa"/>
+        <a:font script="Syrn" typeface="Estrangelo Edessa"/>
+        <a:font script="Syrj" typeface="Estrangelo Edessa"/>
+        <a:font script="Syre" typeface="Estrangelo Edessa"/>
+        <a:font script="Sora" typeface="Nirmala UI"/>
+        <a:font script="Tale" typeface="Microsoft Tai Le"/>
+        <a:font script="Talu" typeface="Microsoft New Tai Lue"/>
+        <a:font script="Tfng" typeface="Ebrima"/>
+      </a:minorFont>
+    </a:fontScheme>
+    <a:fmtScheme name="Office">
+      <a:fillStyleLst>
+        <a:solidFill>
+          <a:schemeClr val="phClr"/>
+        </a:solidFill>
+        <a:gradFill rotWithShape="1">
+          <a:gsLst>
+            <a:gs pos="0">
+              <a:schemeClr val="phClr">
+                <a:lumMod val="110000"/>
+                <a:satMod val="105000"/>
+                <a:tint val="67000"/>
+              </a:schemeClr>
+            </a:gs>
+            <a:gs pos="50000">
+              <a:schemeClr val="phClr">
+                <a:lumMod val="105000"/>
+                <a:satMod val="103000"/>
+                <a:tint val="73000"/>
+              </a:schemeClr>
+            </a:gs>
+            <a:gs pos="100000">
+              <a:schemeClr val="phClr">
+                <a:lumMod val="105000"/>
+                <a:satMod val="109000"/>
+                <a:tint val="81000"/>
+              </a:schemeClr>
+            </a:gs>
+          </a:gsLst>
+          <a:lin ang="5400000" scaled="0"/>
+        </a:gradFill>
+        <a:gradFill rotWithShape="1">
+          <a:gsLst>
+            <a:gs pos="0">
+              <a:schemeClr val="phClr">
+                <a:satMod val="103000"/>
+                <a:lumMod val="102000"/>
+                <a:tint val="94000"/>
+              </a:schemeClr>
+            </a:gs>
+            <a:gs pos="50000">
+              <a:schemeClr val="phClr">
+                <a:satMod val="110000"/>
+                <a:lumMod val="100000"/>
+                <a:shade val="100000"/>
+              </a:schemeClr>
+            </a:gs>
+            <a:gs pos="100000">
+              <a:schemeClr val="phClr">
+                <a:lumMod val="99000"/>
+                <a:satMod val="120000"/>
+                <a:shade val="78000"/>
+              </a:schemeClr>
+            </a:gs>
+          </a:gsLst>
+          <a:lin ang="5400000" scaled="0"/>
+        </a:gradFill>
+      </a:fillStyleLst>
+      <a:lnStyleLst>
+        <a:ln w="12700" cap="flat" cmpd="sng" algn="ctr">
+          <a:solidFill>
+            <a:schemeClr val="phClr"/>
+          </a:solidFill>
+          <a:prstDash val="solid"/>
+          <a:miter lim="800000"/>
+        </a:ln>
+        <a:ln w="19050" cap="flat" cmpd="sng" algn="ctr">
+          <a:solidFill>
+            <a:schemeClr val="phClr"/>
+          </a:solidFill>
+          <a:prstDash val="solid"/>
+          <a:miter lim="800000"/>
+        </a:ln>
+        <a:ln w="25400" cap="flat" cmpd="sng" algn="ctr">
+          <a:solidFill>
+            <a:schemeClr val="phClr"/>
+          </a:solidFill>
+          <a:prstDash val="solid"/>
+          <a:miter lim="800000"/>
+        </a:ln>
+      </a:lnStyleLst>
+      <a:effectStyleLst>
+        <a:effectStyle>
+          <a:effectLst/>
+        </a:effectStyle>
+        <a:effectStyle>
+          <a:effectLst/>
+        </a:effectStyle>
+        <a:effectStyle>
+          <a:effectLst>
+            <a:outerShdw blurRad="57150" dist="19050" dir="5400000" algn="ctr" rotWithShape="0">
+              <a:srgbClr val="000000">
+                <a:alpha val="63000"/>
+              </a:srgbClr>
+            </a:outerShdw>
+          </a:effectLst>
+        </a:effectStyle>
+      </a:effectStyleLst>
+      <a:bgFillStyleLst>
+        <a:solidFill>
+          <a:schemeClr val="phClr"/>
+        </a:solidFill>
+        <a:solidFill>
+          <a:schemeClr val="phClr">
+            <a:tint val="95000"/>
+            <a:satMod val="170000"/>
+          </a:schemeClr>
+        </a:solidFill>
+        <a:gradFill rotWithShape="1">
+          <a:gsLst>
+            <a:gs pos="0">
+              <a:schemeClr val="phClr">
+                <a:tint val="93000"/>
+                <a:satMod val="150000"/>
+                <a:shade val="98000"/>
+                <a:lumMod val="102000"/>
+              </a:schemeClr>
+            </a:gs>
+            <a:gs pos="50000">
+              <a:schemeClr val="phClr">
+                <a:tint val="98000"/>
+                <a:satMod val="130000"/>
+                <a:shade val="90000"/>
+                <a:lumMod val="103000"/>
+              </a:schemeClr>
+            </a:gs>
+            <a:gs pos="100000">
+              <a:schemeClr val="phClr">
+                <a:shade val="63000"/>
+                <a:satMod val="120000"/>
+              </a:schemeClr>
+            </a:gs>
+          </a:gsLst>
+          <a:lin ang="5400000" scaled="0"/>
+        </a:gradFill>
+      </a:bgFillStyleLst>
+    </a:fmtScheme>
+  </a:themeElements>
+  <a:objectDefaults>
+    <a:lnDef>
+      <a:spPr/>
+      <a:bodyPr/>
+      <a:lstStyle/>
+      <a:style>
+        <a:lnRef idx="2">
+          <a:schemeClr val="accent1"/>
+        </a:lnRef>
+        <a:fillRef idx="0">
+          <a:schemeClr val="accent1"/>
+        </a:fillRef>
+        <a:effectRef idx="1">
+          <a:schemeClr val="accent1"/>
+        </a:effectRef>
+        <a:fontRef idx="minor">
+          <a:schemeClr val="tx1"/>
+        </a:fontRef>
+      </a:style>
+    </a:lnDef>
+  </a:objectDefaults>
+  <a:extraClrSchemeLst/>
+  <a:extLst>
+    <a:ext uri="{05A4C25C-085E-4340-85A3-A5531E510DB2}">
+      <thm15:themeFamily xmlns:thm15="http://schemas.microsoft.com/office/thememl/2012/main" name="Office Theme" id="{2E142A2C-CD16-42D6-873A-C26D2A0506FA}" vid="{1BDDFF52-6CD6-40A5-AB3C-68EB2F1E4D0A}"/>
+    </a:ext>
+  </a:extLst>
+</a:theme>
 </file>
</xml_diff>